<commit_message>
Update : Final version of the thesis report
</commit_message>
<xml_diff>
--- a/informe_tfg_final.docx
+++ b/informe_tfg_final.docx
@@ -11,23 +11,12 @@
           <w:lang w:val="ca-ES"/>
         </w:rPr>
       </w:pPr>
-      <w:commentRangeStart w:id="0"/>
       <w:r>
         <w:rPr>
           <w:color w:val="000000"/>
           <w:lang w:val="ca-ES"/>
         </w:rPr>
         <w:t>Construcció d’una ETL per a la consolidació de prospecció comercial</w:t>
-      </w:r>
-      <w:commentRangeEnd w:id="0"/>
-      <w:r>
-        <w:commentReference w:id="0"/>
-      </w:r>
-      <w:r>
-        <w:rPr>
-          <w:color w:val="000000"/>
-          <w:lang w:val="ca-ES"/>
-        </w:rPr>
       </w:r>
     </w:p>
     <w:p>
@@ -77,26 +66,6 @@
           <w:lang w:val="ca-ES"/>
         </w:rPr>
         <w:t>—</w:t>
-      </w:r>
-      <w:commentRangeStart w:id="1"/>
-      <w:r>
-        <w:rPr>
-          <w:rStyle w:val="DefaultParagraphFont"/>
-          <w:color w:val="000000"/>
-          <w:lang w:val="ca-ES"/>
-        </w:rPr>
-        <w:t>Resum del projecte, màxim 10 línies.</w:t>
-      </w:r>
-      <w:commentRangeEnd w:id="1"/>
-      <w:r>
-        <w:commentReference w:id="1"/>
-      </w:r>
-      <w:r>
-        <w:rPr>
-          <w:rStyle w:val="DefaultParagraphFont"/>
-          <w:color w:val="000000"/>
-          <w:lang w:val="ca-ES"/>
-        </w:rPr>
       </w:r>
     </w:p>
     <w:p>
@@ -180,7 +149,7 @@
           <w:shd w:fill="auto" w:val="clear"/>
           <w:lang w:val="ca-ES"/>
         </w:rPr>
-        <w:t>—Paraules clau del projecte, màxim 2 línies.</w:t>
+        <w:t>—</w:t>
       </w:r>
     </w:p>
     <w:p>
@@ -248,7 +217,7 @@
           <w:color w:val="000000"/>
           <w:lang w:val="ca-ES"/>
         </w:rPr>
-        <w:t>—Versió en anglès del resum.</w:t>
+        <w:t>—</w:t>
       </w:r>
     </w:p>
     <w:p>
@@ -291,7 +260,7 @@
           <w:color w:val="000000"/>
           <w:lang w:val="ca-ES"/>
         </w:rPr>
-        <w:t>—Versió en anglès de les paraules clau.</w:t>
+        <w:t>—</w:t>
       </w:r>
     </w:p>
     <w:p>
@@ -1806,7 +1775,7 @@
           <w:szCs w:val="19"/>
           <w:shd w:fill="auto" w:val="clear"/>
         </w:rPr>
-        <w:t>Apache Spark: Dissenyat per al processament distribuït de grans volums de dades. Permet processar terabytes de dades distribuïnt la càrrega entre múltiples nodes. Per al volum actual del projecte (~700-2.000 registres), Spark seria sobre-engineering amb un cost de configuració elevat. Tanmateix, si el pipeline hagués de processar milions de registres, Spark o Dask serien alternatives recomanables.</w:t>
+        <w:t>Apache Spark: Dissenyat per al processament distribuït de grans volums de dades. Permet processar terabytes de dades distribuïnt la càrrega entre múltiples nodes. Per al volum actual del projecte (~2.500 registres), Spark seria sobre-engineering amb un cost de configuració elevat. Tanmateix, si el pipeline hagués de processar milions de registres, Spark o Dask serien alternatives recomanables.</w:t>
       </w:r>
     </w:p>
     <w:p>
@@ -1903,27 +1872,7 @@
           <w:shd w:fill="auto" w:val="clear"/>
           <w:lang w:val="ca-ES"/>
         </w:rPr>
-        <w:t xml:space="preserve">5 </w:t>
-      </w:r>
-      <w:commentRangeStart w:id="2"/>
-      <w:r>
-        <w:rPr>
-          <w:color w:val="000000"/>
-          <w:shd w:fill="auto" w:val="clear"/>
-          <w:lang w:val="ca-ES"/>
-        </w:rPr>
-        <w:t>Anàlisis i disseny</w:t>
-      </w:r>
-      <w:commentRangeEnd w:id="2"/>
-      <w:r>
-        <w:commentReference w:id="2"/>
-      </w:r>
-      <w:r>
-        <w:rPr>
-          <w:color w:val="000000"/>
-          <w:shd w:fill="auto" w:val="clear"/>
-          <w:lang w:val="ca-ES"/>
-        </w:rPr>
+        <w:t>5 Anàlisis i disseny</w:t>
       </w:r>
     </w:p>
     <w:p>
@@ -2086,9 +2035,7 @@
         <w:spacing w:lineRule="auto" w:line="240"/>
         <w:ind w:left="0" w:right="0" w:hanging="0"/>
         <w:rPr>
-          <w:szCs w:val="19"/>
-          <w:shd w:fill="FFFF00" w:val="clear"/>
-          <w:lang w:val="es-ES"/>
+          <w:shd w:fill="auto" w:val="clear"/>
         </w:rPr>
       </w:pPr>
       <w:r>
@@ -2097,21 +2044,10 @@
           <w:color w:val="000000"/>
           <w:sz w:val="19"/>
           <w:szCs w:val="19"/>
-          <w:shd w:fill="FFFF00" w:val="clear"/>
+          <w:shd w:fill="auto" w:val="clear"/>
           <w:lang w:val="es-ES"/>
         </w:rPr>
-        <w:t xml:space="preserve">Cal destacar que la selecció d’aquestes tres fonts no respon únicament a un criteri de representativitat teòrica, sinó que es correspon exactament amb les plataformes de prospecció comercial que el client real utilitza en el seu entorn de treball; el pipeline s’ha dissenyat, per tant, ajustant-se a un cas d’ús real concret i no a un escenari simulat o acadèmic. </w:t>
-      </w:r>
-      <w:r>
-        <w:rPr>
-          <w:rFonts w:ascii="Palatino   " w:hAnsi="Palatino   "/>
-          <w:color w:val="000000"/>
-          <w:sz w:val="19"/>
-          <w:szCs w:val="19"/>
-          <w:shd w:fill="auto" w:val="clear"/>
-          <w:lang w:val="es-ES"/>
-        </w:rPr>
-        <w:t xml:space="preserve">Aquestes tres plataformes s’han seleccionat perquè representen els tres paradigmes principals d’obtenció de dades de prospecció B2B: una plataforma d’execució de campanyes amb base de contactes pròpia (Outreach), una base de dades d’intel·ligència comercial de gran escala (ZoomInfo), i un servei de dades amb verificació humana orientat a comptes complexos (LeadGenius). Aquesta heterogeneïtat és representativa de l’stack tecnològic habitual en equips de vendes B2B, on és freqüent combinar múltiples fonts amb formats i nivells de qualitat diferents. </w:t>
+        <w:t xml:space="preserve">Cal destacar que la selecció d’aquestes tres fonts no respon únicament a un criteri de representativitat teòrica, sinó que es correspon exactament amb les plataformes de prospecció comercial que el client real utilitza en el seu entorn de treball; el pipeline s’ha dissenyat, per tant, ajustant-se a un cas d’ús real concret i no a un escenari simulat o acadèmic. Aquestes tres plataformes s’han seleccionat perquè representen els tres paradigmes principals d’obtenció de dades de prospecció B2B: una plataforma d’execució de campanyes amb base de contactes pròpia (Outreach), una base de dades d’intel·ligència comercial de gran escala (ZoomInfo), i un servei de dades amb verificació humana orientat a comptes complexos (LeadGenius). Aquesta heterogeneïtat és representativa de l’stack tecnològic habitual en equips de vendes B2B, on és freqüent combinar múltiples fonts amb formats i nivells de qualitat diferents. </w:t>
       </w:r>
     </w:p>
     <w:p>
@@ -4795,292 +4731,6 @@
     </w:p>
     <w:p>
       <w:pPr>
-        <w:pStyle w:val="Normal"/>
-        <w:rPr>
-          <w:shd w:fill="auto" w:val="clear"/>
-        </w:rPr>
-      </w:pPr>
-      <w:r>
-        <w:rPr>
-          <w:rFonts w:ascii="Palatino  " w:hAnsi="Palatino  "/>
-          <w:sz w:val="19"/>
-          <w:szCs w:val="19"/>
-          <w:shd w:fill="auto" w:val="clear"/>
-        </w:rPr>
-        <w:t xml:space="preserve">Temps d'execució reals (mesurat amb time.perf_counter): </w:t>
-      </w:r>
-    </w:p>
-    <w:p>
-      <w:pPr>
-        <w:pStyle w:val="Normal"/>
-        <w:rPr>
-          <w:shd w:fill="auto" w:val="clear"/>
-        </w:rPr>
-      </w:pPr>
-      <w:commentRangeStart w:id="3"/>
-      <w:r>
-        <w:rPr>
-          <w:rFonts w:ascii="Palatino  " w:hAnsi="Palatino  "/>
-          <w:sz w:val="19"/>
-          <w:szCs w:val="19"/>
-          <w:shd w:fill="auto" w:val="clear"/>
-        </w:rPr>
-        <w:t>Part 1 (Account Setup, 175 reg.): Load (accounts+CRM) 14.454s → Duplicate checks 0.004s → Enrich from CRM 0.017s → Clean</w:t>
-      </w:r>
-      <w:r>
-        <w:rPr>
-          <w:rFonts w:eastAsia="Times New Roman" w:cs="Times New Roman" w:ascii="Palatino  " w:hAnsi="Palatino  "/>
-          <w:b w:val="false"/>
-          <w:bCs w:val="false"/>
-          <w:i w:val="false"/>
-          <w:iCs w:val="false"/>
-          <w:caps w:val="false"/>
-          <w:smallCaps w:val="false"/>
-          <w:strike w:val="false"/>
-          <w:dstrike w:val="false"/>
-          <w:outline w:val="false"/>
-          <w:emboss w:val="false"/>
-          <w:imprint w:val="false"/>
-          <w:color w:val="000000"/>
-          <w:spacing w:val="0"/>
-          <w:w w:val="100"/>
-          <w:kern w:val="2"/>
-          <w:position w:val="0"/>
-          <w:sz w:val="19"/>
-          <w:sz w:val="19"/>
-          <w:szCs w:val="19"/>
-          <w:u w:val="none"/>
-          <w:shd w:fill="auto" w:val="clear"/>
-          <w:vertAlign w:val="baseline"/>
-          <w:em w:val="none"/>
-          <w:lang w:val="en-US" w:eastAsia="en-US" w:bidi="ar-SA"/>
-        </w:rPr>
-        <w:t>ing</w:t>
-      </w:r>
-      <w:r>
-        <w:rPr>
-          <w:rFonts w:ascii="Palatino  " w:hAnsi="Palatino  "/>
-          <w:sz w:val="19"/>
-          <w:szCs w:val="19"/>
-          <w:shd w:fill="auto" w:val="clear"/>
-        </w:rPr>
-        <w:t xml:space="preserve"> 0.004s → Sort + Rename 0.002s → Export 0.003s</w:t>
-      </w:r>
-      <w:commentRangeEnd w:id="3"/>
-      <w:r>
-        <w:commentReference w:id="3"/>
-      </w:r>
-      <w:r>
-        <w:rPr>
-          <w:rFonts w:ascii="Palatino  " w:hAnsi="Palatino  "/>
-          <w:sz w:val="19"/>
-          <w:szCs w:val="19"/>
-          <w:shd w:fill="auto" w:val="clear"/>
-        </w:rPr>
-      </w:r>
-    </w:p>
-    <w:p>
-      <w:pPr>
-        <w:pStyle w:val="Normal"/>
-        <w:rPr>
-          <w:shd w:fill="auto" w:val="clear"/>
-        </w:rPr>
-      </w:pPr>
-      <w:r>
-        <w:rPr>
-          <w:rFonts w:ascii="Palatino  " w:hAnsi="Palatino  "/>
-          <w:sz w:val="19"/>
-          <w:szCs w:val="19"/>
-          <w:shd w:fill="auto" w:val="clear"/>
-        </w:rPr>
-        <w:t>Total: 14.483s (12reg/s).</w:t>
-      </w:r>
-    </w:p>
-    <w:p>
-      <w:pPr>
-        <w:pStyle w:val="Normal"/>
-        <w:rPr>
-          <w:shd w:fill="auto" w:val="clear"/>
-        </w:rPr>
-      </w:pPr>
-      <w:r>
-        <w:rPr>
-          <w:rFonts w:ascii="Palatino  " w:hAnsi="Palatino  "/>
-          <w:sz w:val="19"/>
-          <w:szCs w:val="19"/>
-          <w:shd w:fill="auto" w:val="clear"/>
-        </w:rPr>
-        <w:t xml:space="preserve">Part 2 (Outreach, 669 reg.): Load 0.039s → Conversions 0.014s → Validació 0.547s → Export Issues 0.219s → Re-import (after manual fix) 597.363s → Export Deliv. 1.008s. </w:t>
-      </w:r>
-    </w:p>
-    <w:p>
-      <w:pPr>
-        <w:pStyle w:val="Normal"/>
-        <w:rPr>
-          <w:shd w:fill="auto" w:val="clear"/>
-        </w:rPr>
-      </w:pPr>
-      <w:r>
-        <w:rPr>
-          <w:rFonts w:ascii="Palatino  " w:hAnsi="Palatino  "/>
-          <w:sz w:val="19"/>
-          <w:szCs w:val="19"/>
-          <w:shd w:fill="auto" w:val="clear"/>
-        </w:rPr>
-        <w:t>Total (sense comptar el manual fix): 1.826s (</w:t>
-      </w:r>
-      <w:r>
-        <w:rPr>
-          <w:rFonts w:eastAsia="Times New Roman" w:cs="Times New Roman" w:ascii="Palatino  " w:hAnsi="Palatino  "/>
-          <w:b w:val="false"/>
-          <w:bCs w:val="false"/>
-          <w:i w:val="false"/>
-          <w:iCs w:val="false"/>
-          <w:caps w:val="false"/>
-          <w:smallCaps w:val="false"/>
-          <w:strike w:val="false"/>
-          <w:dstrike w:val="false"/>
-          <w:outline w:val="false"/>
-          <w:emboss w:val="false"/>
-          <w:imprint w:val="false"/>
-          <w:color w:val="000000"/>
-          <w:spacing w:val="0"/>
-          <w:w w:val="100"/>
-          <w:kern w:val="2"/>
-          <w:position w:val="0"/>
-          <w:sz w:val="19"/>
-          <w:sz w:val="19"/>
-          <w:szCs w:val="19"/>
-          <w:u w:val="none"/>
-          <w:shd w:fill="auto" w:val="clear"/>
-          <w:vertAlign w:val="baseline"/>
-          <w:em w:val="none"/>
-          <w:lang w:val="en-US" w:eastAsia="en-US" w:bidi="ar-SA"/>
-        </w:rPr>
-        <w:t>366</w:t>
-      </w:r>
-      <w:r>
-        <w:rPr>
-          <w:rFonts w:ascii="Palatino  " w:hAnsi="Palatino  "/>
-          <w:sz w:val="19"/>
-          <w:szCs w:val="19"/>
-          <w:shd w:fill="auto" w:val="clear"/>
-        </w:rPr>
-        <w:t xml:space="preserve"> reg/s). </w:t>
-      </w:r>
-    </w:p>
-    <w:p>
-      <w:pPr>
-        <w:pStyle w:val="Normal"/>
-        <w:rPr>
-          <w:shd w:fill="auto" w:val="clear"/>
-        </w:rPr>
-      </w:pPr>
-      <w:r>
-        <w:rPr>
-          <w:rFonts w:ascii="Palatino  " w:hAnsi="Palatino  "/>
-          <w:sz w:val="19"/>
-          <w:szCs w:val="19"/>
-          <w:shd w:fill="auto" w:val="clear"/>
-        </w:rPr>
-        <w:t xml:space="preserve">Part 3 (ZoomInfo, 683 reg. acum.): Load 0.006s → Conversions 0.286 → Validació 0.036s → Export Issues 0.163s → Re-import (after manual fix) 41.859s → Export Deliv. 0.223s. </w:t>
-      </w:r>
-    </w:p>
-    <w:p>
-      <w:pPr>
-        <w:pStyle w:val="Normal"/>
-        <w:rPr>
-          <w:shd w:fill="auto" w:val="clear"/>
-        </w:rPr>
-      </w:pPr>
-      <w:r>
-        <w:rPr>
-          <w:rFonts w:ascii="Palatino  " w:hAnsi="Palatino  "/>
-          <w:sz w:val="19"/>
-          <w:szCs w:val="19"/>
-          <w:shd w:fill="auto" w:val="clear"/>
-        </w:rPr>
-        <w:t xml:space="preserve">Total (sense comptar el manual fix): 0.716s (953 reg/s). </w:t>
-      </w:r>
-    </w:p>
-    <w:p>
-      <w:pPr>
-        <w:pStyle w:val="Normal"/>
-        <w:rPr>
-          <w:shd w:fill="auto" w:val="clear"/>
-        </w:rPr>
-      </w:pPr>
-      <w:r>
-        <w:rPr>
-          <w:rFonts w:ascii="Palatino  " w:hAnsi="Palatino  "/>
-          <w:b w:val="false"/>
-          <w:bCs w:val="false"/>
-          <w:sz w:val="19"/>
-          <w:szCs w:val="19"/>
-          <w:shd w:fill="auto" w:val="clear"/>
-        </w:rPr>
-        <w:t xml:space="preserve">Part 4 (LeadGenius, 2.153 reg. acum.): Load 0.681s → Conversions 0.382s → Validació 0.577s → Export Issues 0.332s → Re-import (after manual fix) 480.848s → Export Deliv. 0.888s. </w:t>
-      </w:r>
-    </w:p>
-    <w:p>
-      <w:pPr>
-        <w:pStyle w:val="Normal"/>
-        <w:rPr>
-          <w:shd w:fill="auto" w:val="clear"/>
-        </w:rPr>
-      </w:pPr>
-      <w:r>
-        <w:rPr>
-          <w:rFonts w:ascii="Palatino  " w:hAnsi="Palatino  "/>
-          <w:b w:val="false"/>
-          <w:bCs w:val="false"/>
-          <w:sz w:val="19"/>
-          <w:szCs w:val="19"/>
-          <w:shd w:fill="auto" w:val="clear"/>
-        </w:rPr>
-        <w:t>Total: 2.861s (752 reg/s).</w:t>
-      </w:r>
-    </w:p>
-    <w:p>
-      <w:pPr>
-        <w:pStyle w:val="Normal"/>
-        <w:rPr>
-          <w:shd w:fill="auto" w:val="clear"/>
-        </w:rPr>
-      </w:pPr>
-      <w:r>
-        <w:rPr>
-          <w:rFonts w:ascii="Palatino  " w:hAnsi="Palatino  "/>
-          <w:b w:val="false"/>
-          <w:bCs w:val="false"/>
-          <w:sz w:val="19"/>
-          <w:szCs w:val="19"/>
-          <w:shd w:fill="auto" w:val="clear"/>
-        </w:rPr>
-        <w:t xml:space="preserve">Part 5 (.xlsx → .csv, 1208 reg.): Load 10.529s → CSV Exports 0.445s </w:t>
-      </w:r>
-    </w:p>
-    <w:p>
-      <w:pPr>
-        <w:pStyle w:val="Normal"/>
-        <w:rPr>
-          <w:shd w:fill="auto" w:val="clear"/>
-        </w:rPr>
-      </w:pPr>
-      <w:r>
-        <w:rPr>
-          <w:rFonts w:ascii="Palatino  " w:hAnsi="Palatino  "/>
-          <w:b w:val="false"/>
-          <w:bCs w:val="false"/>
-          <w:sz w:val="19"/>
-          <w:szCs w:val="19"/>
-          <w:shd w:fill="auto" w:val="clear"/>
-        </w:rPr>
-        <w:t>Total: 10.974s (111 reg/s)</w:t>
-      </w:r>
-    </w:p>
-    <w:p>
-      <w:pPr>
         <w:pStyle w:val="Cuerpodetexto"/>
         <w:tabs>
           <w:tab w:val="clear" w:pos="720"/>
@@ -5114,7 +4764,7 @@
           <w:sz w:val="19"/>
           <w:szCs w:val="19"/>
           <w:u w:val="none"/>
-          <w:shd w:fill="FFFF00" w:val="clear"/>
+          <w:shd w:fill="auto" w:val="clear"/>
           <w:vertAlign w:val="baseline"/>
           <w:em w:val="none"/>
           <w:lang w:val="ca-ES" w:eastAsia="en-US" w:bidi="ar-SA"/>
@@ -5143,7 +4793,7 @@
           <w:sz w:val="19"/>
           <w:szCs w:val="19"/>
           <w:u w:val="none"/>
-          <w:shd w:fill="FFFF00" w:val="clear"/>
+          <w:shd w:fill="auto" w:val="clear"/>
           <w:vertAlign w:val="baseline"/>
           <w:em w:val="none"/>
           <w:lang w:val="ca-ES" w:eastAsia="en-US" w:bidi="ar-SA"/>
@@ -5174,7 +4824,7 @@
           <w:sz w:val="19"/>
           <w:szCs w:val="19"/>
           <w:u w:val="none"/>
-          <w:shd w:fill="FFFF00" w:val="clear"/>
+          <w:shd w:fill="auto" w:val="clear"/>
           <w:vertAlign w:val="baseline"/>
           <w:em w:val="none"/>
           <w:lang w:val="ca-ES" w:eastAsia="en-US" w:bidi="ar-SA"/>
@@ -5203,7 +4853,7 @@
           <w:sz w:val="19"/>
           <w:szCs w:val="19"/>
           <w:u w:val="none"/>
-          <w:shd w:fill="FFFF00" w:val="clear"/>
+          <w:shd w:fill="auto" w:val="clear"/>
           <w:vertAlign w:val="baseline"/>
           <w:em w:val="none"/>
           <w:lang w:val="ca-ES" w:eastAsia="en-US" w:bidi="ar-SA"/>
@@ -5234,7 +4884,7 @@
           <w:sz w:val="19"/>
           <w:szCs w:val="19"/>
           <w:u w:val="none"/>
-          <w:shd w:fill="FFFF00" w:val="clear"/>
+          <w:shd w:fill="auto" w:val="clear"/>
           <w:vertAlign w:val="baseline"/>
           <w:em w:val="none"/>
           <w:lang w:val="ca-ES" w:eastAsia="en-US" w:bidi="ar-SA"/>
@@ -5263,7 +4913,7 @@
           <w:sz w:val="19"/>
           <w:szCs w:val="19"/>
           <w:u w:val="none"/>
-          <w:shd w:fill="FFFF00" w:val="clear"/>
+          <w:shd w:fill="auto" w:val="clear"/>
           <w:vertAlign w:val="baseline"/>
           <w:em w:val="none"/>
           <w:lang w:val="ca-ES" w:eastAsia="en-US" w:bidi="ar-SA"/>
@@ -5294,7 +4944,7 @@
           <w:sz w:val="19"/>
           <w:szCs w:val="19"/>
           <w:u w:val="none"/>
-          <w:shd w:fill="FFFF00" w:val="clear"/>
+          <w:shd w:fill="auto" w:val="clear"/>
           <w:vertAlign w:val="baseline"/>
           <w:em w:val="none"/>
           <w:lang w:val="ca-ES" w:eastAsia="en-US" w:bidi="ar-SA"/>
@@ -5309,46 +4959,46 @@
       </w:pPr>
       <w:r>
         <w:rPr>
-          <w:shd w:fill="FFFF00" w:val="clear"/>
+          <w:shd w:fill="auto" w:val="clear"/>
         </w:rPr>
         <w:t xml:space="preserve">Pel que fa a la </w:t>
       </w:r>
       <w:r>
         <w:rPr>
           <w:rStyle w:val="Muydestacado"/>
-          <w:shd w:fill="FFFF00" w:val="clear"/>
+          <w:shd w:fill="auto" w:val="clear"/>
         </w:rPr>
         <w:t>Part 2 (Outreach)</w:t>
       </w:r>
       <w:r>
         <w:rPr>
-          <w:shd w:fill="FFFF00" w:val="clear"/>
+          <w:shd w:fill="auto" w:val="clear"/>
         </w:rPr>
         <w:t xml:space="preserve">, es van processar 669 prospectes en </w:t>
       </w:r>
       <w:r>
         <w:rPr>
           <w:rStyle w:val="Muydestacado"/>
-          <w:shd w:fill="FFFF00" w:val="clear"/>
+          <w:shd w:fill="auto" w:val="clear"/>
         </w:rPr>
         <w:t>1,826 segons</w:t>
       </w:r>
       <w:r>
         <w:rPr>
-          <w:shd w:fill="FFFF00" w:val="clear"/>
+          <w:shd w:fill="auto" w:val="clear"/>
         </w:rPr>
         <w:t xml:space="preserve">, sense considerar el temps dedicat a la revisió manual d'incidències, assolint una taxa de processament de </w:t>
       </w:r>
       <w:r>
         <w:rPr>
           <w:rStyle w:val="Muydestacado"/>
-          <w:shd w:fill="FFFF00" w:val="clear"/>
+          <w:shd w:fill="auto" w:val="clear"/>
         </w:rPr>
         <w:t>366 registres per segon</w:t>
       </w:r>
       <w:r>
         <w:rPr>
-          <w:shd w:fill="FFFF00" w:val="clear"/>
+          <w:shd w:fill="auto" w:val="clear"/>
         </w:rPr>
         <w:t>. En aquest cas, la fase de validació i la generació del fitxer final constitueixen els principals costos computacionals automàtics. Tot i això, el temps total del procés es veu fortament condicionat per la intervenció manual necessària per resoldre incidències detectades durant la validació.</w:t>
       </w:r>
@@ -5360,46 +5010,46 @@
       </w:pPr>
       <w:r>
         <w:rPr>
-          <w:shd w:fill="FFFF00" w:val="clear"/>
+          <w:shd w:fill="auto" w:val="clear"/>
         </w:rPr>
         <w:t xml:space="preserve">La </w:t>
       </w:r>
       <w:r>
         <w:rPr>
           <w:rStyle w:val="Muydestacado"/>
-          <w:shd w:fill="FFFF00" w:val="clear"/>
+          <w:shd w:fill="auto" w:val="clear"/>
         </w:rPr>
         <w:t>Part 3 (ZoomInfo)</w:t>
       </w:r>
       <w:r>
         <w:rPr>
-          <w:shd w:fill="FFFF00" w:val="clear"/>
+          <w:shd w:fill="auto" w:val="clear"/>
         </w:rPr>
         <w:t xml:space="preserve"> presenta el millor comportament en termes de rendiment. El processament de 683 registres es completa en només </w:t>
       </w:r>
       <w:r>
         <w:rPr>
           <w:rStyle w:val="Muydestacado"/>
-          <w:shd w:fill="FFFF00" w:val="clear"/>
+          <w:shd w:fill="auto" w:val="clear"/>
         </w:rPr>
         <w:t>0,716 segons</w:t>
       </w:r>
       <w:r>
         <w:rPr>
-          <w:shd w:fill="FFFF00" w:val="clear"/>
+          <w:shd w:fill="auto" w:val="clear"/>
         </w:rPr>
         <w:t xml:space="preserve">, equivalent a una taxa de </w:t>
       </w:r>
       <w:r>
         <w:rPr>
           <w:rStyle w:val="Muydestacado"/>
-          <w:shd w:fill="FFFF00" w:val="clear"/>
+          <w:shd w:fill="auto" w:val="clear"/>
         </w:rPr>
         <w:t>953 registres per segon</w:t>
       </w:r>
       <w:r>
         <w:rPr>
-          <w:shd w:fill="FFFF00" w:val="clear"/>
+          <w:shd w:fill="auto" w:val="clear"/>
         </w:rPr>
         <w:t>. Aquest elevat rendiment s'explica principalment per la naturalesa de les transformacions aplicades i per l'ús d'estratègies de recuperació de dades ja optimitzades, fet que permet minimitzar el cost de les validacions posteriors.</w:t>
       </w:r>
@@ -5411,46 +5061,46 @@
       </w:pPr>
       <w:r>
         <w:rPr>
-          <w:shd w:fill="FFFF00" w:val="clear"/>
+          <w:shd w:fill="auto" w:val="clear"/>
         </w:rPr>
         <w:t xml:space="preserve">En la </w:t>
       </w:r>
       <w:r>
         <w:rPr>
           <w:rStyle w:val="Muydestacado"/>
-          <w:shd w:fill="FFFF00" w:val="clear"/>
+          <w:shd w:fill="auto" w:val="clear"/>
         </w:rPr>
         <w:t>Part 4 (LeadGenius)</w:t>
       </w:r>
       <w:r>
         <w:rPr>
-          <w:shd w:fill="FFFF00" w:val="clear"/>
+          <w:shd w:fill="auto" w:val="clear"/>
         </w:rPr>
         <w:t xml:space="preserve"> es van processar un total acumulat de 2.153 registres en </w:t>
       </w:r>
       <w:r>
         <w:rPr>
           <w:rStyle w:val="Muydestacado"/>
-          <w:shd w:fill="FFFF00" w:val="clear"/>
+          <w:shd w:fill="auto" w:val="clear"/>
         </w:rPr>
         <w:t>2,861 segons</w:t>
       </w:r>
       <w:r>
         <w:rPr>
-          <w:shd w:fill="FFFF00" w:val="clear"/>
+          <w:shd w:fill="auto" w:val="clear"/>
         </w:rPr>
         <w:t xml:space="preserve">, assolint una taxa de </w:t>
       </w:r>
       <w:r>
         <w:rPr>
           <w:rStyle w:val="Muydestacado"/>
-          <w:shd w:fill="FFFF00" w:val="clear"/>
+          <w:shd w:fill="auto" w:val="clear"/>
         </w:rPr>
         <w:t>752 registres per segon</w:t>
       </w:r>
       <w:r>
         <w:rPr>
-          <w:shd w:fill="FFFF00" w:val="clear"/>
+          <w:shd w:fill="auto" w:val="clear"/>
         </w:rPr>
         <w:t>. Encara que aquesta fase incorpora validacions addicionals, com el filtratge de registres verificats i la normalització de números de telèfon segons l'estàndard internacional E.164, el sistema manté un rendiment elevat gràcies a la reutilització de la lògica comuna implementada al motor compartit.</w:t>
       </w:r>
@@ -5462,46 +5112,46 @@
       </w:pPr>
       <w:r>
         <w:rPr>
-          <w:shd w:fill="FFFF00" w:val="clear"/>
+          <w:shd w:fill="auto" w:val="clear"/>
         </w:rPr>
         <w:t xml:space="preserve">Finalment, la </w:t>
       </w:r>
       <w:r>
         <w:rPr>
           <w:rStyle w:val="Muydestacado"/>
-          <w:shd w:fill="FFFF00" w:val="clear"/>
+          <w:shd w:fill="auto" w:val="clear"/>
         </w:rPr>
         <w:t>Part 5</w:t>
       </w:r>
       <w:r>
         <w:rPr>
-          <w:shd w:fill="FFFF00" w:val="clear"/>
+          <w:shd w:fill="auto" w:val="clear"/>
         </w:rPr>
         <w:t xml:space="preserve">, encarregada de transformar el fitxer consolidat des del format XLSX al format CSV compatible amb el CRM, va requerir </w:t>
       </w:r>
       <w:r>
         <w:rPr>
           <w:rStyle w:val="Muydestacado"/>
-          <w:shd w:fill="FFFF00" w:val="clear"/>
+          <w:shd w:fill="auto" w:val="clear"/>
         </w:rPr>
         <w:t>10,974 segons</w:t>
       </w:r>
       <w:r>
         <w:rPr>
-          <w:shd w:fill="FFFF00" w:val="clear"/>
+          <w:shd w:fill="auto" w:val="clear"/>
         </w:rPr>
         <w:t xml:space="preserve"> per processar 1.208 registres, equivalent a </w:t>
       </w:r>
       <w:r>
         <w:rPr>
           <w:rStyle w:val="Muydestacado"/>
-          <w:shd w:fill="FFFF00" w:val="clear"/>
+          <w:shd w:fill="auto" w:val="clear"/>
         </w:rPr>
         <w:t>111 registres per segon</w:t>
       </w:r>
       <w:r>
         <w:rPr>
-          <w:shd w:fill="FFFF00" w:val="clear"/>
+          <w:shd w:fill="auto" w:val="clear"/>
         </w:rPr>
         <w:t>. Igual que a la Part 1, la major part del temps d'execució correspon a la càrrega inicial del fitxer, mentre que l'exportació final presenta un cost molt reduït.</w:t>
       </w:r>
@@ -5510,48 +5160,80 @@
       <w:pPr>
         <w:pStyle w:val="Cuerpodetexto"/>
         <w:rPr>
-          <w:shd w:fill="FFFF00" w:val="clear"/>
-        </w:rPr>
-      </w:pPr>
-      <w:commentRangeStart w:id="4"/>
-      <w:r>
-        <w:rPr>
-          <w:shd w:fill="FFFF00" w:val="clear"/>
+          <w:shd w:fill="auto" w:val="clear"/>
+        </w:rPr>
+      </w:pPr>
+      <w:r>
+        <w:rPr>
+          <w:shd w:fill="auto" w:val="clear"/>
         </w:rPr>
         <w:t>En conjunt, els resultats obtinguts demostren que el pipeline és capaç de processar volums significatius de dades en temps inferiors als tres segons per a les fases principals de transformació i validació. Això representa una reducció substancial respecte al procés manual original, que requeria entre quatre i sis hores de treball humà per consolidar la informació procedent de les diferents fonts. Cal destacar que el principal factor temporal del procés continua sent la revisió manual de les incidències detctades, fet que reforça la importància dels mecanismes de qualitat de dades implementats i obre la porta a futures línies de treball orientades a incrementar encara més el nivell d'automatització.</w:t>
       </w:r>
-      <w:commentRangeEnd w:id="4"/>
-      <w:r>
-        <w:commentReference w:id="4"/>
-      </w:r>
-      <w:r>
-        <w:rPr>
-          <w:shd w:fill="FFFF00" w:val="clear"/>
-        </w:rPr>
-      </w:r>
-    </w:p>
-    <w:p>
-      <w:pPr>
-        <w:pStyle w:val="Normal"/>
-        <w:tabs>
-          <w:tab w:val="clear" w:pos="720"/>
-          <w:tab w:val="left" w:pos="0" w:leader="none"/>
-        </w:tabs>
-        <w:spacing w:lineRule="auto" w:line="240"/>
-        <w:ind w:left="0" w:right="0" w:hanging="0"/>
-        <w:rPr>
-          <w:rStyle w:val="DefaultParagraphFont"/>
-          <w:szCs w:val="19"/>
-          <w:shd w:fill="FFFF00" w:val="clear"/>
-          <w:lang w:val="ca-ES"/>
-        </w:rPr>
-      </w:pPr>
-      <w:r>
-        <w:rPr>
-          <w:szCs w:val="19"/>
-          <w:shd w:fill="FFFF00" w:val="clear"/>
-          <w:lang w:val="ca-ES"/>
-        </w:rPr>
+    </w:p>
+    <w:p>
+      <w:pPr>
+        <w:pStyle w:val="Cuerpodetexto"/>
+        <w:rPr>
+          <w:shd w:fill="auto" w:val="clear"/>
+        </w:rPr>
+      </w:pPr>
+      <w:r>
+        <w:rPr/>
+      </w:r>
+    </w:p>
+    <w:p>
+      <w:pPr>
+        <w:pStyle w:val="Cuerpodetexto"/>
+        <w:rPr>
+          <w:shd w:fill="auto" w:val="clear"/>
+        </w:rPr>
+      </w:pPr>
+      <w:r>
+        <w:rPr/>
+      </w:r>
+    </w:p>
+    <w:p>
+      <w:pPr>
+        <w:pStyle w:val="Cuerpodetexto"/>
+        <w:rPr>
+          <w:shd w:fill="auto" w:val="clear"/>
+        </w:rPr>
+      </w:pPr>
+      <w:r>
+        <w:rPr/>
+      </w:r>
+    </w:p>
+    <w:p>
+      <w:pPr>
+        <w:pStyle w:val="Cuerpodetexto"/>
+        <w:rPr>
+          <w:shd w:fill="auto" w:val="clear"/>
+        </w:rPr>
+      </w:pPr>
+      <w:r>
+        <w:rPr/>
+      </w:r>
+    </w:p>
+    <w:p>
+      <w:pPr>
+        <w:pStyle w:val="Cuerpodetexto"/>
+        <w:rPr>
+          <w:shd w:fill="auto" w:val="clear"/>
+        </w:rPr>
+      </w:pPr>
+      <w:r>
+        <w:rPr/>
+      </w:r>
+    </w:p>
+    <w:p>
+      <w:pPr>
+        <w:pStyle w:val="Cuerpodetexto"/>
+        <w:rPr>
+          <w:shd w:fill="auto" w:val="clear"/>
+        </w:rPr>
+      </w:pPr>
+      <w:r>
+        <w:rPr/>
       </w:r>
     </w:p>
     <w:tbl>
@@ -5569,8 +5251,8 @@
       </w:tblPr>
       <w:tblGrid>
         <w:gridCol w:w="1132"/>
-        <w:gridCol w:w="821"/>
-        <w:gridCol w:w="978"/>
+        <w:gridCol w:w="820"/>
+        <w:gridCol w:w="979"/>
         <w:gridCol w:w="977"/>
         <w:gridCol w:w="974"/>
       </w:tblGrid>
@@ -5602,7 +5284,7 @@
         </w:tc>
         <w:tc>
           <w:tcPr>
-            <w:tcW w:w="821" w:type="dxa"/>
+            <w:tcW w:w="820" w:type="dxa"/>
             <w:tcBorders/>
           </w:tcPr>
           <w:p>
@@ -5626,7 +5308,7 @@
         </w:tc>
         <w:tc>
           <w:tcPr>
-            <w:tcW w:w="978" w:type="dxa"/>
+            <w:tcW w:w="979" w:type="dxa"/>
             <w:tcBorders/>
           </w:tcPr>
           <w:p>
@@ -5724,7 +5406,7 @@
         </w:tc>
         <w:tc>
           <w:tcPr>
-            <w:tcW w:w="821" w:type="dxa"/>
+            <w:tcW w:w="820" w:type="dxa"/>
             <w:tcBorders/>
           </w:tcPr>
           <w:p>
@@ -5747,7 +5429,7 @@
         </w:tc>
         <w:tc>
           <w:tcPr>
-            <w:tcW w:w="978" w:type="dxa"/>
+            <w:tcW w:w="979" w:type="dxa"/>
             <w:tcBorders/>
           </w:tcPr>
           <w:p>
@@ -5779,7 +5461,7 @@
               <w:widowControl w:val="false"/>
               <w:spacing w:before="0" w:after="200"/>
               <w:rPr>
-                <w:rFonts w:ascii="Palatino" w:hAnsi="Palatino" w:eastAsia="Times New Roman" w:cs="Times New Roman"/>
+                <w:rFonts w:eastAsia="Times New Roman" w:cs="Times New Roman"/>
                 <w:b w:val="false"/>
                 <w:b w:val="false"/>
                 <w:bCs w:val="false"/>
@@ -5851,7 +5533,7 @@
               <w:widowControl w:val="false"/>
               <w:spacing w:before="0" w:after="200"/>
               <w:rPr>
-                <w:rFonts w:ascii="Palatino" w:hAnsi="Palatino" w:eastAsia="Times New Roman" w:cs="Times New Roman"/>
+                <w:rFonts w:eastAsia="Times New Roman" w:cs="Times New Roman"/>
                 <w:b w:val="false"/>
                 <w:b w:val="false"/>
                 <w:bCs w:val="false"/>
@@ -5939,7 +5621,7 @@
         </w:tc>
         <w:tc>
           <w:tcPr>
-            <w:tcW w:w="821" w:type="dxa"/>
+            <w:tcW w:w="820" w:type="dxa"/>
             <w:tcBorders/>
           </w:tcPr>
           <w:p>
@@ -5961,7 +5643,7 @@
         </w:tc>
         <w:tc>
           <w:tcPr>
-            <w:tcW w:w="978" w:type="dxa"/>
+            <w:tcW w:w="979" w:type="dxa"/>
             <w:tcBorders/>
           </w:tcPr>
           <w:p>
@@ -5992,7 +5674,7 @@
               <w:widowControl w:val="false"/>
               <w:spacing w:before="0" w:after="200"/>
               <w:rPr>
-                <w:rFonts w:ascii="Palatino" w:hAnsi="Palatino" w:eastAsia="Times New Roman" w:cs="Times New Roman"/>
+                <w:rFonts w:eastAsia="Times New Roman" w:cs="Times New Roman"/>
                 <w:b w:val="false"/>
                 <w:b w:val="false"/>
                 <w:bCs w:val="false"/>
@@ -6064,7 +5746,7 @@
               <w:widowControl w:val="false"/>
               <w:spacing w:before="0" w:after="200"/>
               <w:rPr>
-                <w:rFonts w:ascii="Palatino" w:hAnsi="Palatino" w:eastAsia="Times New Roman" w:cs="Times New Roman"/>
+                <w:rFonts w:eastAsia="Times New Roman" w:cs="Times New Roman"/>
                 <w:b w:val="false"/>
                 <w:b w:val="false"/>
                 <w:bCs w:val="false"/>
@@ -6152,7 +5834,7 @@
         </w:tc>
         <w:tc>
           <w:tcPr>
-            <w:tcW w:w="821" w:type="dxa"/>
+            <w:tcW w:w="820" w:type="dxa"/>
             <w:tcBorders/>
           </w:tcPr>
           <w:p>
@@ -6174,7 +5856,7 @@
         </w:tc>
         <w:tc>
           <w:tcPr>
-            <w:tcW w:w="978" w:type="dxa"/>
+            <w:tcW w:w="979" w:type="dxa"/>
             <w:tcBorders/>
           </w:tcPr>
           <w:p>
@@ -6268,7 +5950,7 @@
         </w:tc>
         <w:tc>
           <w:tcPr>
-            <w:tcW w:w="821" w:type="dxa"/>
+            <w:tcW w:w="820" w:type="dxa"/>
             <w:tcBorders/>
           </w:tcPr>
           <w:p>
@@ -6291,7 +5973,7 @@
         </w:tc>
         <w:tc>
           <w:tcPr>
-            <w:tcW w:w="978" w:type="dxa"/>
+            <w:tcW w:w="979" w:type="dxa"/>
             <w:tcBorders/>
           </w:tcPr>
           <w:p>
@@ -6323,7 +6005,7 @@
               <w:widowControl w:val="false"/>
               <w:spacing w:before="0" w:after="200"/>
               <w:rPr>
-                <w:rFonts w:ascii="Palatino" w:hAnsi="Palatino" w:eastAsia="Times New Roman" w:cs="Times New Roman"/>
+                <w:rFonts w:eastAsia="Times New Roman" w:cs="Times New Roman"/>
                 <w:b w:val="false"/>
                 <w:b w:val="false"/>
                 <w:bCs w:val="false"/>
@@ -6465,7 +6147,7 @@
         </w:tc>
         <w:tc>
           <w:tcPr>
-            <w:tcW w:w="821" w:type="dxa"/>
+            <w:tcW w:w="820" w:type="dxa"/>
             <w:tcBorders/>
           </w:tcPr>
           <w:p>
@@ -6488,7 +6170,7 @@
         </w:tc>
         <w:tc>
           <w:tcPr>
-            <w:tcW w:w="978" w:type="dxa"/>
+            <w:tcW w:w="979" w:type="dxa"/>
             <w:tcBorders/>
           </w:tcPr>
           <w:p>
@@ -6583,7 +6265,7 @@
         </w:tc>
         <w:tc>
           <w:tcPr>
-            <w:tcW w:w="821" w:type="dxa"/>
+            <w:tcW w:w="820" w:type="dxa"/>
             <w:tcBorders/>
           </w:tcPr>
           <w:p>
@@ -6605,7 +6287,7 @@
         </w:tc>
         <w:tc>
           <w:tcPr>
-            <w:tcW w:w="978" w:type="dxa"/>
+            <w:tcW w:w="979" w:type="dxa"/>
             <w:tcBorders/>
           </w:tcPr>
           <w:p>
@@ -6698,7 +6380,7 @@
         </w:tc>
         <w:tc>
           <w:tcPr>
-            <w:tcW w:w="821" w:type="dxa"/>
+            <w:tcW w:w="820" w:type="dxa"/>
             <w:tcBorders/>
           </w:tcPr>
           <w:p>
@@ -6720,7 +6402,7 @@
         </w:tc>
         <w:tc>
           <w:tcPr>
-            <w:tcW w:w="978" w:type="dxa"/>
+            <w:tcW w:w="979" w:type="dxa"/>
             <w:tcBorders/>
           </w:tcPr>
           <w:p>
@@ -6813,7 +6495,7 @@
         </w:tc>
         <w:tc>
           <w:tcPr>
-            <w:tcW w:w="821" w:type="dxa"/>
+            <w:tcW w:w="820" w:type="dxa"/>
             <w:tcBorders/>
           </w:tcPr>
           <w:p>
@@ -6835,7 +6517,7 @@
         </w:tc>
         <w:tc>
           <w:tcPr>
-            <w:tcW w:w="978" w:type="dxa"/>
+            <w:tcW w:w="979" w:type="dxa"/>
             <w:tcBorders/>
           </w:tcPr>
           <w:p>
@@ -6928,7 +6610,7 @@
         </w:tc>
         <w:tc>
           <w:tcPr>
-            <w:tcW w:w="821" w:type="dxa"/>
+            <w:tcW w:w="820" w:type="dxa"/>
             <w:tcBorders/>
           </w:tcPr>
           <w:p>
@@ -6950,7 +6632,7 @@
         </w:tc>
         <w:tc>
           <w:tcPr>
-            <w:tcW w:w="978" w:type="dxa"/>
+            <w:tcW w:w="979" w:type="dxa"/>
             <w:tcBorders/>
           </w:tcPr>
           <w:p>
@@ -7044,7 +6726,7 @@
         </w:tc>
         <w:tc>
           <w:tcPr>
-            <w:tcW w:w="821" w:type="dxa"/>
+            <w:tcW w:w="820" w:type="dxa"/>
             <w:tcBorders/>
           </w:tcPr>
           <w:p>
@@ -7067,7 +6749,7 @@
         </w:tc>
         <w:tc>
           <w:tcPr>
-            <w:tcW w:w="978" w:type="dxa"/>
+            <w:tcW w:w="979" w:type="dxa"/>
             <w:tcBorders/>
           </w:tcPr>
           <w:p>
@@ -7163,7 +6845,7 @@
         </w:tc>
         <w:tc>
           <w:tcPr>
-            <w:tcW w:w="821" w:type="dxa"/>
+            <w:tcW w:w="820" w:type="dxa"/>
             <w:tcBorders/>
           </w:tcPr>
           <w:p>
@@ -7186,7 +6868,7 @@
         </w:tc>
         <w:tc>
           <w:tcPr>
-            <w:tcW w:w="978" w:type="dxa"/>
+            <w:tcW w:w="979" w:type="dxa"/>
             <w:tcBorders/>
           </w:tcPr>
           <w:p>
@@ -7281,7 +6963,7 @@
         </w:tc>
         <w:tc>
           <w:tcPr>
-            <w:tcW w:w="821" w:type="dxa"/>
+            <w:tcW w:w="820" w:type="dxa"/>
             <w:tcBorders/>
           </w:tcPr>
           <w:p>
@@ -7303,7 +6985,7 @@
         </w:tc>
         <w:tc>
           <w:tcPr>
-            <w:tcW w:w="978" w:type="dxa"/>
+            <w:tcW w:w="979" w:type="dxa"/>
             <w:tcBorders/>
           </w:tcPr>
           <w:p>
@@ -7393,9 +7075,7 @@
       <w:pPr>
         <w:pStyle w:val="Normal"/>
         <w:rPr>
-          <w:i w:val="false"/>
-          <w:i w:val="false"/>
-          <w:iCs w:val="false"/>
+          <w:shd w:fill="auto" w:val="clear"/>
         </w:rPr>
       </w:pPr>
       <w:r>
@@ -7405,7 +7085,7 @@
           <w:iCs w:val="false"/>
           <w:sz w:val="19"/>
           <w:szCs w:val="19"/>
-          <w:shd w:fill="FFFF00" w:val="clear"/>
+          <w:shd w:fill="auto" w:val="clear"/>
           <w:lang w:val="ca-ES"/>
         </w:rPr>
         <w:t>Els valors de la Taula 2 permeten extreure diverses observacions rellevants. En primer lloc, el camp Bad Country només s’aplica a la Part 4 (LeadGenius), ja que les altres dues fonts filtren els registres de país incorrecte directament durant el processament (Part 3) en lloc de marcar-los com a incidència; per tant, el valor 0 d’Outreach i ZoomInfo no implica que aquestes fonts no presentin problemes de país, sinó que es gestionen mitjançant un mecanisme diferent. En segon lloc, LeadGenius concentra la major part de les incidències totals (1.920 de 2.133, un 90 %) tot i aportar només un 70 % dels prospectes processats; una part important d’aquest desequilibri s’explica per la seva elevada taxa de duplicats (1.145, un 72,5 % dels seus registres), fet consistent amb la seva posició al final del pipeline: en processar-se després d’Outreach i ZoomInfo, els seus registres es comparen contra un conjunt acumulat molt més gran de contactes ja existents, la qual cosa incrementa estructuralment la probabilitat de detectar-hi duplicats. Aquesta xifra revela, de fet, un solapament rellevant entre les bases de dades de diferents proveïdors B2B, una observació que reforça la necessitat pràctica del pipeline. En tercer lloc, les taxes de Bad Domain (4,2 %) i Bad Email (1,1 %) de LeadGenius són notablement més baixes que les d’Outreach (8,1 % i 5,4 % respectivament), la qual cosa confirma empíricament l’afirmació feta a la secció 5.1.3 sobre la seva major completesa derivada de la revisió humana. Finalment, cal tenir present que el volum de ZoomInfo (14 registres) és massa reduït per extreure’n conclusions estadísticament sòlides.</w:t>
@@ -7423,7 +7103,6 @@
           <w:shd w:fill="auto" w:val="clear"/>
         </w:rPr>
       </w:pPr>
-      <w:commentRangeStart w:id="5"/>
       <w:r>
         <w:rPr>
           <w:color w:val="000000"/>
@@ -7433,17 +7112,6 @@
         <w:t>7</w:t>
         <w:tab/>
         <w:t>Conclusió</w:t>
-      </w:r>
-      <w:commentRangeEnd w:id="5"/>
-      <w:r>
-        <w:commentReference w:id="5"/>
-      </w:r>
-      <w:r>
-        <w:rPr>
-          <w:color w:val="000000"/>
-          <w:shd w:fill="auto" w:val="clear"/>
-          <w:lang w:val="ca-ES"/>
-        </w:rPr>
       </w:r>
     </w:p>
     <w:p>
@@ -7509,157 +7177,9 @@
           <w:lang w:val="ca-ES"/>
         </w:rPr>
         <w:t>La refactorització [7] ha reduït les Parts 2, 3 i 4 de scripts monolítics de 400-600 línies a fitxers de configuració d’aproximadament 100 línies cadascun, mentre utils.py centralitza la lògica compartida. Això redueix el risc d’inconsistències entre fonts, facilita el manteniment i permet incorporar noves fonts definint només un nou diccionari CONFIG. Les deu comprovacions automàtiques de qualitat han demostrat ser efectives en la detecció dels errors més freqüents en dades de prospecció comercial (correus invàlids, duplicats, discrepàncies de gènere i de país).</w:t>
-      </w:r>
-    </w:p>
-    <w:p>
-      <w:pPr>
-        <w:pStyle w:val="Texto"/>
-        <w:spacing w:lineRule="auto" w:line="240"/>
-        <w:ind w:left="0" w:right="0" w:hanging="0"/>
-        <w:rPr/>
-      </w:pPr>
-      <w:commentRangeStart w:id="6"/>
-      <w:r>
-        <w:rPr>
-          <w:rStyle w:val="DefaultParagraphFont"/>
-          <w:rFonts w:ascii="Palatino" w:hAnsi="Palatino"/>
-          <w:color w:val="000000"/>
-          <w:sz w:val="19"/>
-          <w:szCs w:val="19"/>
-          <w:shd w:fill="auto" w:val="clear"/>
-          <w:lang w:val="ca-ES"/>
-        </w:rPr>
-        <w:t xml:space="preserve">Com es detalla a la secció 8, entre altres, la limitació principal d’aquest sistema es que requereix una intervenció manual al pas de revisió d’incidències. Malgrat que aquest pas garanteix la superioritat de la revisió humana per a casos ambigus, suposa un punt de bloqueig en el flux automàtic. </w:t>
-      </w:r>
-    </w:p>
-    <w:p>
-      <w:pPr>
-        <w:pStyle w:val="Texto"/>
-        <w:spacing w:lineRule="auto" w:line="240"/>
-        <w:ind w:left="0" w:right="0" w:hanging="0"/>
-        <w:rPr/>
-      </w:pPr>
-      <w:r>
-        <w:rPr>
-          <w:rStyle w:val="DefaultParagraphFont"/>
-          <w:rFonts w:ascii="Palatino" w:hAnsi="Palatino"/>
-          <w:color w:val="000000"/>
-          <w:sz w:val="19"/>
-          <w:szCs w:val="19"/>
-          <w:shd w:fill="auto" w:val="clear"/>
-          <w:lang w:val="ca-ES"/>
-        </w:rPr>
-        <w:t xml:space="preserve">En el treball futur es proposen mecanismes per reduir la </w:t>
-      </w:r>
-      <w:r>
-        <w:rPr>
-          <w:rStyle w:val="DefaultParagraphFont"/>
-          <w:rFonts w:eastAsia="Times New Roman" w:cs="Times New Roman" w:ascii="Palatino" w:hAnsi="Palatino"/>
-          <w:b w:val="false"/>
-          <w:bCs w:val="false"/>
-          <w:i w:val="false"/>
-          <w:iCs w:val="false"/>
-          <w:caps w:val="false"/>
-          <w:smallCaps w:val="false"/>
-          <w:strike w:val="false"/>
-          <w:dstrike w:val="false"/>
-          <w:outline w:val="false"/>
-          <w:emboss w:val="false"/>
-          <w:imprint w:val="false"/>
-          <w:color w:val="000000"/>
-          <w:spacing w:val="0"/>
-          <w:w w:val="100"/>
-          <w:kern w:val="0"/>
-          <w:position w:val="0"/>
-          <w:sz w:val="19"/>
-          <w:sz w:val="19"/>
-          <w:szCs w:val="19"/>
-          <w:u w:val="none"/>
-          <w:shd w:fill="auto" w:val="clear"/>
-          <w:vertAlign w:val="baseline"/>
-          <w:em w:val="none"/>
-          <w:lang w:val="ca-ES" w:eastAsia="en-US" w:bidi="ar-SA"/>
-        </w:rPr>
-        <w:t>fricció</w:t>
-      </w:r>
-      <w:r>
-        <w:rPr>
-          <w:rStyle w:val="DefaultParagraphFont"/>
-          <w:rFonts w:ascii="Palatino" w:hAnsi="Palatino"/>
-          <w:color w:val="000000"/>
-          <w:sz w:val="19"/>
-          <w:szCs w:val="19"/>
-          <w:shd w:fill="auto" w:val="clear"/>
-          <w:lang w:val="ca-ES"/>
-        </w:rPr>
-        <w:t xml:space="preserve"> d’aquest pas, com per exemple: l'aprovació automàtica de registres amb un nivell de confiança alt, una interfície web lleugera que permeti revisar les incidències sense haver d'obrir l'Excel, o l'agrupació de les incidències per tipus per permetre revisions per lots en lloc de registre a registre.</w:t>
-      </w:r>
-      <w:commentRangeEnd w:id="6"/>
-      <w:r>
-        <w:commentReference w:id="6"/>
-      </w:r>
-      <w:r>
-        <w:rPr>
-          <w:rStyle w:val="DefaultParagraphFont"/>
-          <w:rFonts w:ascii="Palatino" w:hAnsi="Palatino"/>
-          <w:color w:val="000000"/>
-          <w:sz w:val="19"/>
-          <w:szCs w:val="19"/>
-          <w:shd w:fill="auto" w:val="clear"/>
-          <w:lang w:val="ca-ES"/>
-        </w:rPr>
-      </w:r>
-    </w:p>
-    <w:p>
-      <w:pPr>
-        <w:pStyle w:val="Texto"/>
-        <w:spacing w:lineRule="auto" w:line="240"/>
-        <w:ind w:left="0" w:right="0" w:hanging="0"/>
-        <w:rPr>
-          <w:rStyle w:val="DefaultParagraphFont"/>
-          <w:rFonts w:ascii="Palatino" w:hAnsi="Palatino"/>
-          <w:color w:val="000000"/>
-          <w:sz w:val="19"/>
-          <w:szCs w:val="19"/>
-          <w:shd w:fill="auto" w:val="clear"/>
-          <w:lang w:val="ca-ES"/>
-        </w:rPr>
-      </w:pPr>
-      <w:r>
-        <w:rPr>
-          <w:rFonts w:ascii="Palatino" w:hAnsi="Palatino"/>
-          <w:color w:val="000000"/>
-          <w:sz w:val="19"/>
-          <w:szCs w:val="19"/>
-          <w:shd w:fill="auto" w:val="clear"/>
-          <w:lang w:val="ca-ES"/>
-        </w:rPr>
-      </w:r>
-    </w:p>
-    <w:p>
-      <w:pPr>
-        <w:pStyle w:val="Texto"/>
-        <w:spacing w:lineRule="auto" w:line="240"/>
-        <w:ind w:left="0" w:right="0" w:hanging="0"/>
-        <w:rPr>
-          <w:rStyle w:val="DefaultParagraphFont"/>
-          <w:rFonts w:ascii="Palatino" w:hAnsi="Palatino"/>
-          <w:color w:val="000000"/>
-          <w:sz w:val="19"/>
-          <w:szCs w:val="19"/>
-          <w:shd w:fill="auto" w:val="clear"/>
-          <w:lang w:val="ca-ES"/>
-        </w:rPr>
-      </w:pPr>
-      <w:r>
-        <w:rPr>
-          <w:rFonts w:ascii="Palatino" w:hAnsi="Palatino"/>
-          <w:color w:val="000000"/>
-          <w:sz w:val="19"/>
-          <w:szCs w:val="19"/>
-          <w:shd w:fill="auto" w:val="clear"/>
-          <w:lang w:val="ca-ES"/>
-        </w:rPr>
+        <w:br/>
+        <w:br/>
+        <w:t xml:space="preserve">En definitiva, el projecte ha permès transformar un procés manual, fragmentat i sense traçabilitat en un pipeline ETL automatitzat, reutilitzable i orientat a negoci, capaç de garantir la qualitat de les dades abans de la seva integració al CRM. Els resultats obtinguts evidencien que la solució proposada contribueix a millorar l'eficiència operativa, reduir els errors associats al processament manual i facilitar la disponibilitat de dades fiables per a la captació i retenció de clients. </w:t>
       </w:r>
     </w:p>
     <w:p>
@@ -7672,13 +7192,14 @@
         <w:ind w:left="320" w:right="0" w:hanging="320"/>
         <w:jc w:val="left"/>
         <w:rPr>
-          <w:shd w:fill="FFFF00" w:val="clear"/>
-        </w:rPr>
-      </w:pPr>
-      <w:r>
-        <w:rPr>
-          <w:color w:val="000000"/>
-          <w:shd w:fill="FFFF00" w:val="clear"/>
+          <w:shd w:fill="auto" w:val="clear"/>
+        </w:rPr>
+      </w:pPr>
+      <w:commentRangeStart w:id="0"/>
+      <w:r>
+        <w:rPr>
+          <w:color w:val="000000"/>
+          <w:shd w:fill="auto" w:val="clear"/>
           <w:lang w:val="ca-ES"/>
         </w:rPr>
         <w:t>8</w:t>
@@ -7706,399 +7227,49 @@
           <w:sz w:val="23"/>
           <w:szCs w:val="20"/>
           <w:u w:val="none"/>
-          <w:shd w:fill="FFFF00" w:val="clear"/>
+          <w:shd w:fill="auto" w:val="clear"/>
           <w:vertAlign w:val="baseline"/>
           <w:em w:val="none"/>
           <w:lang w:val="ca-ES" w:eastAsia="en-US" w:bidi="ar-SA"/>
         </w:rPr>
         <w:t>Limitacions</w:t>
       </w:r>
+      <w:commentRangeEnd w:id="0"/>
+      <w:r>
+        <w:commentReference w:id="0"/>
+      </w:r>
+      <w:r>
+        <w:rPr>
+          <w:rFonts w:eastAsia="Helvetica" w:cs="Helvetica"/>
+          <w:b/>
+          <w:bCs w:val="false"/>
+          <w:i w:val="false"/>
+          <w:iCs w:val="false"/>
+          <w:smallCaps/>
+          <w:strike w:val="false"/>
+          <w:dstrike w:val="false"/>
+          <w:outline w:val="false"/>
+          <w:emboss w:val="false"/>
+          <w:imprint w:val="false"/>
+          <w:color w:val="000000"/>
+          <w:spacing w:val="0"/>
+          <w:w w:val="100"/>
+          <w:kern w:val="2"/>
+          <w:position w:val="0"/>
+          <w:sz w:val="23"/>
+          <w:sz w:val="23"/>
+          <w:szCs w:val="20"/>
+          <w:u w:val="none"/>
+          <w:shd w:fill="auto" w:val="clear"/>
+          <w:vertAlign w:val="baseline"/>
+          <w:em w:val="none"/>
+          <w:lang w:val="ca-ES" w:eastAsia="en-US" w:bidi="ar-SA"/>
+        </w:rPr>
+      </w:r>
     </w:p>
     <w:p>
       <w:pPr>
         <w:pStyle w:val="Normal"/>
-        <w:rPr>
-          <w:shd w:fill="FFFF00" w:val="clear"/>
-        </w:rPr>
-      </w:pPr>
-      <w:r>
-        <w:rPr>
-          <w:rFonts w:ascii="Palatino  " w:hAnsi="Palatino  "/>
-          <w:sz w:val="19"/>
-          <w:szCs w:val="19"/>
-          <w:shd w:fill="FFFF00" w:val="clear"/>
-        </w:rPr>
-        <w:t>El sistema actual presenta limitacions importants que cal tenir en compte en l’avaluació dels resultats i que definieixen linies de treball futures:</w:t>
-      </w:r>
-    </w:p>
-    <w:p>
-      <w:pPr>
-        <w:pStyle w:val="Normal"/>
-        <w:rPr>
-          <w:shd w:fill="FFFF00" w:val="clear"/>
-        </w:rPr>
-      </w:pPr>
-      <w:r>
-        <w:rPr>
-          <w:rFonts w:ascii="Palatino  " w:hAnsi="Palatino  "/>
-          <w:b/>
-          <w:bCs/>
-          <w:sz w:val="19"/>
-          <w:szCs w:val="19"/>
-          <w:shd w:fill="FFFF00" w:val="clear"/>
-        </w:rPr>
-        <w:t>Absència de tests automatitzats.</w:t>
-      </w:r>
-      <w:r>
-        <w:rPr>
-          <w:rFonts w:ascii="Palatino  " w:hAnsi="Palatino  "/>
-          <w:sz w:val="19"/>
-          <w:szCs w:val="19"/>
-          <w:shd w:fill="FFFF00" w:val="clear"/>
-        </w:rPr>
-        <w:t xml:space="preserve"> Tot i que la metodologia els menciona, no s'han implementat tests unitaris per verificar el comportament dels components crítics. Cal afegir tests per a les funcions de validació, merge, i exportació abans de considerar el sistema com a producció.</w:t>
-      </w:r>
-    </w:p>
-    <w:p>
-      <w:pPr>
-        <w:pStyle w:val="Normal"/>
-        <w:rPr>
-          <w:shd w:fill="FFFF00" w:val="clear"/>
-        </w:rPr>
-      </w:pPr>
-      <w:r>
-        <w:rPr>
-          <w:rFonts w:ascii="Palatino  " w:hAnsi="Palatino  "/>
-          <w:b/>
-          <w:bCs/>
-          <w:sz w:val="19"/>
-          <w:szCs w:val="19"/>
-          <w:shd w:fill="FFFF00" w:val="clear"/>
-        </w:rPr>
-        <w:t>Marge de millora de les validacions.</w:t>
-      </w:r>
-      <w:r>
-        <w:rPr>
-          <w:rFonts w:ascii="Palatino  " w:hAnsi="Palatino  "/>
-          <w:sz w:val="19"/>
-          <w:szCs w:val="19"/>
-          <w:shd w:fill="FFFF00" w:val="clear"/>
-        </w:rPr>
-        <w:t xml:space="preserve"> La validació de gènere utilitza gender_guesser [14], una llibreria basada en noms d'anglès amb precisió limitada per a noms d'altres llengües. La detecció de duplicats és exacta per nom complet però no detecta duplicats parcials sense fuzzy matching a nivell de registre.</w:t>
-      </w:r>
-    </w:p>
-    <w:p>
-      <w:pPr>
-        <w:pStyle w:val="Normal"/>
-        <w:rPr>
-          <w:shd w:fill="FFFF00" w:val="clear"/>
-        </w:rPr>
-      </w:pPr>
-      <w:r>
-        <w:rPr>
-          <w:rFonts w:ascii="Palatino  " w:hAnsi="Palatino  "/>
-          <w:b/>
-          <w:bCs/>
-          <w:sz w:val="19"/>
-          <w:szCs w:val="19"/>
-          <w:shd w:fill="FFFF00" w:val="clear"/>
-        </w:rPr>
-        <w:t>Dependència de formats fixes.</w:t>
-      </w:r>
-      <w:r>
-        <w:rPr>
-          <w:rFonts w:ascii="Palatino  " w:hAnsi="Palatino  "/>
-          <w:sz w:val="19"/>
-          <w:szCs w:val="19"/>
-          <w:shd w:fill="FFFF00" w:val="clear"/>
-        </w:rPr>
-        <w:t xml:space="preserve"> El sistema assumeix que els fitxers d'entrada tenen l'estructura de columnes esperada. Si una font canvia el format d'exportació, el pipeline pot fallar sense missatges d'error clars. No hi ha un mecanisme de validació d'esquema previ ni de tolerància a canvis de format.</w:t>
-      </w:r>
-    </w:p>
-    <w:p>
-      <w:pPr>
-        <w:pStyle w:val="Normal"/>
-        <w:rPr>
-          <w:shd w:fill="FFFF00" w:val="clear"/>
-        </w:rPr>
-      </w:pPr>
-      <w:r>
-        <w:rPr>
-          <w:rFonts w:ascii="Palatino  " w:hAnsi="Palatino  "/>
-          <w:b/>
-          <w:bCs/>
-          <w:sz w:val="19"/>
-          <w:szCs w:val="19"/>
-          <w:shd w:fill="FFFF00" w:val="clear"/>
-        </w:rPr>
-        <w:t>Escalabilitat limitada.</w:t>
-      </w:r>
-      <w:r>
-        <w:rPr>
-          <w:rFonts w:ascii="Palatino  " w:hAnsi="Palatino  "/>
-          <w:sz w:val="19"/>
-          <w:szCs w:val="19"/>
-          <w:shd w:fill="FFFF00" w:val="clear"/>
-        </w:rPr>
-        <w:t xml:space="preserve"> El pipeline processa les dades en memòria (pandas DataFrames), cosa que limita el volum màxim al disponible en RAM. Per a fitxers amb centenars de milers de registres, caldria implementar processament per chunks o migrar a tecnologies com Apache Spark o Dask/polars out-of-core.</w:t>
-      </w:r>
-    </w:p>
-    <w:p>
-      <w:pPr>
-        <w:pStyle w:val="Normal"/>
-        <w:rPr>
-          <w:shd w:fill="FFFF00" w:val="clear"/>
-        </w:rPr>
-      </w:pPr>
-      <w:r>
-        <w:rPr>
-          <w:rFonts w:ascii="Palatino  " w:hAnsi="Palatino  "/>
-          <w:b/>
-          <w:bCs/>
-          <w:sz w:val="19"/>
-          <w:szCs w:val="19"/>
-          <w:shd w:fill="FFFF00" w:val="clear"/>
-        </w:rPr>
-        <w:t>Intervenció manual requerida</w:t>
-      </w:r>
-      <w:r>
-        <w:rPr>
-          <w:rFonts w:ascii="Palatino  " w:hAnsi="Palatino  "/>
-          <w:sz w:val="19"/>
-          <w:szCs w:val="19"/>
-          <w:shd w:fill="FFFF00" w:val="clear"/>
-        </w:rPr>
-        <w:t>. El punt de pausa per a la revisió d'incidències, tot i garantir la qualitat humana, suposa un punt de bloqueig en el flux automàtic. Per a execucions amb milers de registres, aquest pas pot ser costós en temps. Es proposa com a treball futur l'aprovació automàtica de registres amb un nivell de confiança alt (per exemple, coincidències de fuzzy matching [15] superiors al 95%), reduint la càrrega de revisió manual als casos realment ambigus.</w:t>
-      </w:r>
-    </w:p>
-    <w:p>
-      <w:pPr>
-        <w:pStyle w:val="ReferenceHead"/>
-        <w:jc w:val="left"/>
-        <w:rPr>
-          <w:shd w:fill="FFFF00" w:val="clear"/>
-        </w:rPr>
-      </w:pPr>
-      <w:r>
-        <w:rPr>
-          <w:rFonts w:ascii="Helvetica" w:hAnsi="Helvetica"/>
-          <w:b/>
-          <w:bCs/>
-          <w:color w:val="000000"/>
-          <w:sz w:val="22"/>
-          <w:shd w:fill="FFFF00" w:val="clear"/>
-          <w:lang w:val="ca-ES"/>
-        </w:rPr>
-        <w:t>9 Glossari</w:t>
-      </w:r>
-    </w:p>
-    <w:p>
-      <w:pPr>
-        <w:pStyle w:val="ReferenceHead"/>
-        <w:jc w:val="left"/>
-        <w:rPr>
-          <w:shd w:fill="FFFF00" w:val="clear"/>
-        </w:rPr>
-      </w:pPr>
-      <w:r>
-        <w:rPr>
-          <w:rFonts w:ascii="Helvetica" w:hAnsi="Helvetica"/>
-          <w:b/>
-          <w:bCs/>
-          <w:color w:val="000000"/>
-          <w:sz w:val="22"/>
-          <w:shd w:fill="FFFF00" w:val="clear"/>
-          <w:lang w:val="ca-ES"/>
-        </w:rPr>
-        <w:t>9.1 Llista d’abreviatures i acrònims</w:t>
-      </w:r>
-    </w:p>
-    <w:p>
-      <w:pPr>
-        <w:pStyle w:val="Normal"/>
-        <w:numPr>
-          <w:ilvl w:val="0"/>
-          <w:numId w:val="4"/>
-        </w:numPr>
-        <w:rPr>
-          <w:shd w:fill="FFFF00" w:val="clear"/>
-        </w:rPr>
-      </w:pPr>
-      <w:r>
-        <w:rPr>
-          <w:shd w:fill="FFFF00" w:val="clear"/>
-        </w:rPr>
-        <w:t>ETL: Extract, Transform, Load</w:t>
-      </w:r>
-    </w:p>
-    <w:p>
-      <w:pPr>
-        <w:pStyle w:val="Normal"/>
-        <w:numPr>
-          <w:ilvl w:val="0"/>
-          <w:numId w:val="4"/>
-        </w:numPr>
-        <w:rPr>
-          <w:shd w:fill="FFFF00" w:val="clear"/>
-        </w:rPr>
-      </w:pPr>
-      <w:r>
-        <w:rPr>
-          <w:shd w:fill="FFFF00" w:val="clear"/>
-        </w:rPr>
-        <w:t>CRM: Customer Relationship Management</w:t>
-      </w:r>
-    </w:p>
-    <w:p>
-      <w:pPr>
-        <w:pStyle w:val="Normal"/>
-        <w:numPr>
-          <w:ilvl w:val="0"/>
-          <w:numId w:val="4"/>
-        </w:numPr>
-        <w:rPr>
-          <w:shd w:fill="FFFF00" w:val="clear"/>
-        </w:rPr>
-      </w:pPr>
-      <w:r>
-        <w:rPr>
-          <w:shd w:fill="FFFF00" w:val="clear"/>
-        </w:rPr>
-        <w:t xml:space="preserve">ISO: International Organization for Standardization </w:t>
-      </w:r>
-    </w:p>
-    <w:p>
-      <w:pPr>
-        <w:pStyle w:val="Normal"/>
-        <w:numPr>
-          <w:ilvl w:val="0"/>
-          <w:numId w:val="4"/>
-        </w:numPr>
-        <w:rPr>
-          <w:shd w:fill="FFFF00" w:val="clear"/>
-        </w:rPr>
-      </w:pPr>
-      <w:r>
-        <w:rPr>
-          <w:shd w:fill="FFFF00" w:val="clear"/>
-        </w:rPr>
-        <w:t>ITU: International Telecommunication Union</w:t>
-      </w:r>
-    </w:p>
-    <w:p>
-      <w:pPr>
-        <w:pStyle w:val="Normal"/>
-        <w:numPr>
-          <w:ilvl w:val="0"/>
-          <w:numId w:val="4"/>
-        </w:numPr>
-        <w:rPr>
-          <w:shd w:fill="FFFF00" w:val="clear"/>
-        </w:rPr>
-      </w:pPr>
-      <w:r>
-        <w:rPr>
-          <w:shd w:fill="FFFF00" w:val="clear"/>
-        </w:rPr>
-        <w:t>DOI: Digital Object Identifier</w:t>
-      </w:r>
-    </w:p>
-    <w:p>
-      <w:pPr>
-        <w:pStyle w:val="Normal"/>
-        <w:numPr>
-          <w:ilvl w:val="0"/>
-          <w:numId w:val="4"/>
-        </w:numPr>
-        <w:rPr>
-          <w:shd w:fill="FFFF00" w:val="clear"/>
-        </w:rPr>
-      </w:pPr>
-      <w:r>
-        <w:rPr>
-          <w:shd w:fill="FFFF00" w:val="clear"/>
-        </w:rPr>
-        <w:t>API: Application Programming Interface</w:t>
-      </w:r>
-    </w:p>
-    <w:p>
-      <w:pPr>
-        <w:pStyle w:val="Normal"/>
-        <w:numPr>
-          <w:ilvl w:val="0"/>
-          <w:numId w:val="4"/>
-        </w:numPr>
-        <w:rPr>
-          <w:shd w:fill="FFFF00" w:val="clear"/>
-        </w:rPr>
-      </w:pPr>
-      <w:r>
-        <w:rPr>
-          <w:shd w:fill="FFFF00" w:val="clear"/>
-        </w:rPr>
-        <w:t>XLSX: Microsoft XML Spreadsheet</w:t>
-      </w:r>
-    </w:p>
-    <w:p>
-      <w:pPr>
-        <w:pStyle w:val="Normal"/>
-        <w:numPr>
-          <w:ilvl w:val="0"/>
-          <w:numId w:val="4"/>
-        </w:numPr>
-        <w:rPr>
-          <w:shd w:fill="FFFF00" w:val="clear"/>
-        </w:rPr>
-      </w:pPr>
-      <w:r>
-        <w:rPr>
-          <w:shd w:fill="FFFF00" w:val="clear"/>
-        </w:rPr>
-        <w:t>CSV: Comma-Separated Values</w:t>
-      </w:r>
-    </w:p>
-    <w:p>
-      <w:pPr>
-        <w:pStyle w:val="Normal"/>
-        <w:numPr>
-          <w:ilvl w:val="0"/>
-          <w:numId w:val="4"/>
-        </w:numPr>
-        <w:rPr>
-          <w:shd w:fill="FFFF00" w:val="clear"/>
-        </w:rPr>
-      </w:pPr>
-      <w:r>
-        <w:rPr>
-          <w:shd w:fill="FFFF00" w:val="clear"/>
-        </w:rPr>
-        <w:t xml:space="preserve">DRY: Don't Repeat Yourself </w:t>
-      </w:r>
-    </w:p>
-    <w:p>
-      <w:pPr>
-        <w:pStyle w:val="Normal"/>
-        <w:numPr>
-          <w:ilvl w:val="0"/>
-          <w:numId w:val="4"/>
-        </w:numPr>
-        <w:rPr>
-          <w:shd w:fill="FFFF00" w:val="clear"/>
-        </w:rPr>
-      </w:pPr>
-      <w:r>
-        <w:rPr>
-          <w:shd w:fill="FFFF00" w:val="clear"/>
-        </w:rPr>
-        <w:t>CONFIG: Configuration Dictionary</w:t>
-      </w:r>
-    </w:p>
-    <w:p>
-      <w:pPr>
-        <w:pStyle w:val="Ttulo1"/>
-        <w:tabs>
-          <w:tab w:val="left" w:pos="0" w:leader="none"/>
-        </w:tabs>
         <w:spacing w:lineRule="auto" w:line="240"/>
         <w:ind w:left="0" w:right="0" w:hanging="0"/>
         <w:rPr/>
@@ -8107,303 +7278,35 @@
         <w:rPr>
           <w:rStyle w:val="DefaultParagraphFont"/>
           <w:color w:val="000000"/>
-          <w:shd w:fill="FFFF00" w:val="clear"/>
-          <w:lang w:val="es-ES"/>
-        </w:rPr>
-        <w:t>9.2 Definició de termes clau</w:t>
-      </w:r>
-    </w:p>
-    <w:p>
-      <w:pPr>
-        <w:pStyle w:val="Normal"/>
-        <w:numPr>
-          <w:ilvl w:val="0"/>
-          <w:numId w:val="3"/>
-        </w:numPr>
-        <w:tabs>
-          <w:tab w:val="clear" w:pos="720"/>
-          <w:tab w:val="left" w:pos="0" w:leader="none"/>
-        </w:tabs>
-        <w:spacing w:lineRule="auto" w:line="240"/>
-        <w:rPr>
-          <w:shd w:fill="FFFF00" w:val="clear"/>
-        </w:rPr>
-      </w:pPr>
-      <w:r>
-        <w:rPr>
-          <w:rFonts w:ascii="Palatino   " w:hAnsi="Palatino   "/>
           <w:sz w:val="19"/>
           <w:szCs w:val="19"/>
-          <w:shd w:fill="FFFF00" w:val="clear"/>
-        </w:rPr>
-        <w:t>Pipeline ETL: Conducte de dades que realitza tres fases: Extracció (lectura de fonts), Transformació (neteja, fusió, validació) i Càrrega (exportació de resultats).</w:t>
+          <w:shd w:fill="auto" w:val="clear"/>
+          <w:lang w:val="ca-ES"/>
+        </w:rPr>
+        <w:t xml:space="preserve">La limitació principal, entre altres, d’aquest sistema es que requereix una intervenció manual al pas de revisió d’incidències. Malgrat que aquest pas garanteix la superioritat de la revisió humana per a casos ambigus, suposa un punt de bloqueig en el flux automàtic. </w:t>
       </w:r>
     </w:p>
     <w:p>
       <w:pPr>
         <w:pStyle w:val="Normal"/>
-        <w:numPr>
-          <w:ilvl w:val="0"/>
-          <w:numId w:val="3"/>
-        </w:numPr>
-        <w:tabs>
-          <w:tab w:val="clear" w:pos="720"/>
-          <w:tab w:val="left" w:pos="0" w:leader="none"/>
-        </w:tabs>
-        <w:spacing w:lineRule="auto" w:line="240"/>
-        <w:rPr>
-          <w:shd w:fill="FFFF00" w:val="clear"/>
-        </w:rPr>
-      </w:pPr>
-      <w:r>
-        <w:rPr>
-          <w:rFonts w:ascii="Palatino   " w:hAnsi="Palatino   "/>
+        <w:rPr>
+          <w:shd w:fill="auto" w:val="clear"/>
+        </w:rPr>
+      </w:pPr>
+      <w:r>
+        <w:rPr>
+          <w:rStyle w:val="DefaultParagraphFont"/>
+          <w:color w:val="000000"/>
           <w:sz w:val="19"/>
           <w:szCs w:val="19"/>
-          <w:shd w:fill="FFFF00" w:val="clear"/>
-        </w:rPr>
-        <w:t>Prospecte: Registre d'un contacte comercial potencial, amb dades com nom, empresa, correu electrònic i telèfon, entre altres.</w:t>
-      </w:r>
-    </w:p>
-    <w:p>
-      <w:pPr>
-        <w:pStyle w:val="Normal"/>
-        <w:numPr>
-          <w:ilvl w:val="0"/>
-          <w:numId w:val="3"/>
-        </w:numPr>
-        <w:tabs>
-          <w:tab w:val="clear" w:pos="720"/>
-          <w:tab w:val="left" w:pos="0" w:leader="none"/>
-        </w:tabs>
-        <w:spacing w:lineRule="auto" w:line="240"/>
-        <w:rPr>
-          <w:shd w:fill="FFFF00" w:val="clear"/>
-        </w:rPr>
-      </w:pPr>
-      <w:r>
-        <w:rPr>
-          <w:rFonts w:ascii="Palatino   " w:hAnsi="Palatino   "/>
-          <w:sz w:val="19"/>
-          <w:szCs w:val="19"/>
-          <w:shd w:fill="FFFF00" w:val="clear"/>
-        </w:rPr>
-        <w:t>Merge Strategy: Estrègia per enllaçar prospectes amb els seus comptes. Tres variants: custom_id (per ID directe), zi_fallback (Custom Id → Website → Query Name) i company_name (per nom d'empresa).</w:t>
-      </w:r>
-    </w:p>
-    <w:p>
-      <w:pPr>
-        <w:pStyle w:val="Normal"/>
-        <w:numPr>
-          <w:ilvl w:val="0"/>
-          <w:numId w:val="3"/>
-        </w:numPr>
-        <w:tabs>
-          <w:tab w:val="clear" w:pos="720"/>
-          <w:tab w:val="left" w:pos="0" w:leader="none"/>
-        </w:tabs>
-        <w:spacing w:lineRule="auto" w:line="240"/>
-        <w:rPr>
-          <w:shd w:fill="FFFF00" w:val="clear"/>
-        </w:rPr>
-      </w:pPr>
-      <w:r>
-        <w:rPr>
-          <w:rFonts w:ascii="Palatino   " w:hAnsi="Palatino   "/>
-          <w:sz w:val="19"/>
-          <w:szCs w:val="19"/>
-          <w:shd w:fill="FFFF00" w:val="clear"/>
-        </w:rPr>
-        <w:t>Deliverable: Fitxer de lliurament final (xlsx) que conté els prospectes enriquits i validats, preparat per a la importació al CRM.</w:t>
-      </w:r>
-    </w:p>
-    <w:p>
-      <w:pPr>
-        <w:pStyle w:val="Normal"/>
-        <w:numPr>
-          <w:ilvl w:val="0"/>
-          <w:numId w:val="3"/>
-        </w:numPr>
-        <w:tabs>
-          <w:tab w:val="clear" w:pos="720"/>
-          <w:tab w:val="left" w:pos="0" w:leader="none"/>
-        </w:tabs>
-        <w:spacing w:lineRule="auto" w:line="240"/>
-        <w:rPr>
-          <w:shd w:fill="FFFF00" w:val="clear"/>
-        </w:rPr>
-      </w:pPr>
-      <w:r>
-        <w:rPr>
-          <w:rFonts w:ascii="Palatino   " w:hAnsi="Palatino   "/>
-          <w:sz w:val="19"/>
-          <w:szCs w:val="19"/>
-          <w:shd w:fill="FFFF00" w:val="clear"/>
-        </w:rPr>
-        <w:t>Dummy: Registre fictici en la llista de comptes que no correspon a una empresa real. S'identifica pel camp 'Account Name' que conté la paraula 'dummy'.</w:t>
-      </w:r>
-    </w:p>
-    <w:p>
-      <w:pPr>
-        <w:pStyle w:val="Normal"/>
-        <w:numPr>
-          <w:ilvl w:val="0"/>
-          <w:numId w:val="3"/>
-        </w:numPr>
-        <w:tabs>
-          <w:tab w:val="clear" w:pos="720"/>
-          <w:tab w:val="left" w:pos="0" w:leader="none"/>
-        </w:tabs>
-        <w:spacing w:lineRule="auto" w:line="240"/>
-        <w:rPr>
-          <w:shd w:fill="FFFF00" w:val="clear"/>
-        </w:rPr>
-      </w:pPr>
-      <w:r>
-        <w:rPr>
-          <w:rFonts w:ascii="Palatino   " w:hAnsi="Palatino   "/>
-          <w:sz w:val="19"/>
-          <w:szCs w:val="19"/>
-          <w:shd w:fill="FFFF00" w:val="clear"/>
-        </w:rPr>
-        <w:t>Threshold: Nombre màxim de prospectes permesos per compte. Els registres que superen aquest llindar es marquen com 'Extra'.</w:t>
-      </w:r>
-    </w:p>
-    <w:p>
-      <w:pPr>
-        <w:pStyle w:val="Normal"/>
-        <w:numPr>
-          <w:ilvl w:val="0"/>
-          <w:numId w:val="3"/>
-        </w:numPr>
-        <w:tabs>
-          <w:tab w:val="clear" w:pos="720"/>
-          <w:tab w:val="left" w:pos="0" w:leader="none"/>
-        </w:tabs>
-        <w:spacing w:lineRule="auto" w:line="240"/>
-        <w:rPr>
-          <w:shd w:fill="FFFF00" w:val="clear"/>
-        </w:rPr>
-      </w:pPr>
-      <w:r>
-        <w:rPr>
-          <w:rFonts w:ascii="Palatino   " w:hAnsi="Palatino   "/>
-          <w:sz w:val="19"/>
-          <w:szCs w:val="19"/>
-          <w:shd w:fill="FFFF00" w:val="clear"/>
-        </w:rPr>
-        <w:t>CONFIG: Diccionari de configuració que defineix tots els paràmetres específics de cada font de dades (noms de co</w:t>
-      </w:r>
-      <w:r>
-        <w:rPr>
-          <w:rFonts w:ascii="Palatino   " w:hAnsi="Palatino   "/>
-          <w:b w:val="false"/>
-          <w:bCs w:val="false"/>
-          <w:sz w:val="19"/>
-          <w:szCs w:val="19"/>
-          <w:shd w:fill="FFFF00" w:val="clear"/>
-        </w:rPr>
-        <w:t>lumnes, estratègia de fusió, filtres, validacions).</w:t>
-      </w:r>
-    </w:p>
-    <w:p>
-      <w:pPr>
-        <w:pStyle w:val="Normal"/>
-        <w:numPr>
-          <w:ilvl w:val="0"/>
-          <w:numId w:val="3"/>
-        </w:numPr>
-        <w:tabs>
-          <w:tab w:val="clear" w:pos="720"/>
-          <w:tab w:val="left" w:pos="0" w:leader="none"/>
-        </w:tabs>
-        <w:spacing w:lineRule="auto" w:line="240"/>
-        <w:jc w:val="left"/>
-        <w:rPr>
-          <w:b w:val="false"/>
-          <w:b w:val="false"/>
-          <w:bCs w:val="false"/>
-          <w:shd w:fill="FFFF00" w:val="clear"/>
-        </w:rPr>
-      </w:pPr>
-      <w:r>
-        <w:rPr>
-          <w:rFonts w:ascii="Palatino   " w:hAnsi="Palatino   "/>
-          <w:b w:val="false"/>
-          <w:bCs w:val="false"/>
-          <w:color w:val="000000"/>
-          <w:sz w:val="19"/>
-          <w:szCs w:val="19"/>
-          <w:shd w:fill="FFFF00" w:val="clear"/>
-          <w:lang w:val="ca-ES"/>
-        </w:rPr>
-        <w:t>Prospect ID: Identificador únic assignat a cada prospecte amb format PREFIX + número de 4 dígits (p.ex. Z0001).</w:t>
-      </w:r>
-    </w:p>
-    <w:p>
-      <w:pPr>
-        <w:pStyle w:val="ReferenceHead"/>
-        <w:jc w:val="left"/>
-        <w:rPr>
-          <w:shd w:fill="auto" w:val="clear"/>
-        </w:rPr>
-      </w:pPr>
-      <w:r>
-        <w:rPr>
-          <w:rFonts w:ascii="Helvetica" w:hAnsi="Helvetica"/>
-          <w:b/>
-          <w:bCs/>
-          <w:color w:val="000000"/>
-          <w:sz w:val="22"/>
-          <w:shd w:fill="auto" w:val="clear"/>
-          <w:lang w:val="ca-ES"/>
-        </w:rPr>
-        <w:t>Agraïments</w:t>
-      </w:r>
-    </w:p>
-    <w:p>
-      <w:pPr>
-        <w:pStyle w:val="Cuerpodetexto"/>
-        <w:spacing w:lineRule="auto" w:line="240"/>
-        <w:rPr>
-          <w:shd w:fill="auto" w:val="clear"/>
-        </w:rPr>
-      </w:pPr>
-      <w:r>
-        <w:rPr>
-          <w:color w:val="000000"/>
-          <w:shd w:fill="auto" w:val="clear"/>
-          <w:lang w:val="ca-ES"/>
-        </w:rPr>
-        <w:t xml:space="preserve">En primer lloc, vull expressar el meu sincer agraïment al meu tutor de projecte, Daniel Franco, pel seu guiatge, paciència i suport constant al llarg del desenvolupament d'aquest Treball de Final de Grau. Els seus consells tècnics i la seva visió estratègica han estat claus per modelar l'enfocament d'aquest </w:t>
-      </w:r>
-      <w:r>
-        <w:rPr>
-          <w:i/>
-          <w:color w:val="000000"/>
-          <w:shd w:fill="auto" w:val="clear"/>
-          <w:lang w:val="ca-ES"/>
-        </w:rPr>
-        <w:t>pipeline</w:t>
-      </w:r>
-      <w:r>
-        <w:rPr>
-          <w:color w:val="000000"/>
-          <w:shd w:fill="auto" w:val="clear"/>
-          <w:lang w:val="ca-ES"/>
-        </w:rPr>
-        <w:t xml:space="preserve"> ETL.</w:t>
-      </w:r>
-    </w:p>
-    <w:p>
-      <w:pPr>
-        <w:pStyle w:val="Cuerpodetexto"/>
-        <w:rPr>
-          <w:shd w:fill="auto" w:val="clear"/>
-        </w:rPr>
-      </w:pPr>
-      <w:r>
-        <w:rPr>
+          <w:shd w:fill="auto" w:val="clear"/>
+          <w:lang w:val="ca-ES"/>
+        </w:rPr>
+        <w:t xml:space="preserve">En el treball futur es proposen mecanismes per reduir la </w:t>
+      </w:r>
+      <w:r>
+        <w:rPr>
+          <w:rStyle w:val="DefaultParagraphFont"/>
           <w:rFonts w:eastAsia="Times New Roman" w:cs="Times New Roman"/>
           <w:b w:val="false"/>
           <w:bCs w:val="false"/>
@@ -8419,24 +7322,224 @@
           <w:color w:val="000000"/>
           <w:spacing w:val="0"/>
           <w:w w:val="100"/>
-          <w:kern w:val="2"/>
+          <w:kern w:val="0"/>
           <w:position w:val="0"/>
           <w:sz w:val="19"/>
           <w:sz w:val="19"/>
-          <w:szCs w:val="20"/>
+          <w:szCs w:val="19"/>
           <w:u w:val="none"/>
           <w:shd w:fill="auto" w:val="clear"/>
           <w:vertAlign w:val="baseline"/>
           <w:em w:val="none"/>
-          <w:lang w:val="en-US" w:eastAsia="en-US" w:bidi="ar-SA"/>
-        </w:rPr>
-        <w:t>V</w:t>
-      </w:r>
-      <w:r>
-        <w:rPr>
-          <w:shd w:fill="auto" w:val="clear"/>
-        </w:rPr>
-        <w:t>ull estendre aquest agraïment a la Universitat Autònoma de Barcelona (UAB) i a tot el cos docent del grau en Enginyeria de Dades, per haver-me proporcionat les bases teòriques i pràctiques necessàries per afrontar un projecte d'aquestes característiques.</w:t>
+          <w:lang w:val="ca-ES" w:eastAsia="en-US" w:bidi="ar-SA"/>
+        </w:rPr>
+        <w:t>fricció</w:t>
+      </w:r>
+      <w:r>
+        <w:rPr>
+          <w:rStyle w:val="DefaultParagraphFont"/>
+          <w:color w:val="000000"/>
+          <w:sz w:val="19"/>
+          <w:szCs w:val="19"/>
+          <w:shd w:fill="auto" w:val="clear"/>
+          <w:lang w:val="ca-ES"/>
+        </w:rPr>
+        <w:t xml:space="preserve"> d’aquests passos i limitacions, com per exemple: </w:t>
+      </w:r>
+    </w:p>
+    <w:p>
+      <w:pPr>
+        <w:pStyle w:val="Normal"/>
+        <w:rPr>
+          <w:shd w:fill="auto" w:val="clear"/>
+        </w:rPr>
+      </w:pPr>
+      <w:r>
+        <w:rPr>
+          <w:rFonts w:ascii="Palatino  " w:hAnsi="Palatino  "/>
+          <w:b/>
+          <w:bCs/>
+          <w:sz w:val="19"/>
+          <w:szCs w:val="19"/>
+          <w:shd w:fill="auto" w:val="clear"/>
+        </w:rPr>
+        <w:t>Absència de tests automatitzats.</w:t>
+      </w:r>
+      <w:r>
+        <w:rPr>
+          <w:rFonts w:ascii="Palatino  " w:hAnsi="Palatino  "/>
+          <w:sz w:val="19"/>
+          <w:szCs w:val="19"/>
+          <w:shd w:fill="auto" w:val="clear"/>
+        </w:rPr>
+        <w:t xml:space="preserve"> Tot i que la metodologia els menciona, no s'han implementat tests unitaris per verificar el comportament dels components crítics. Cal afegir tests per a les funcions de validació, merge, i exportació abans de considerar el sistema com a producció.</w:t>
+      </w:r>
+    </w:p>
+    <w:p>
+      <w:pPr>
+        <w:pStyle w:val="Normal"/>
+        <w:rPr>
+          <w:shd w:fill="auto" w:val="clear"/>
+        </w:rPr>
+      </w:pPr>
+      <w:r>
+        <w:rPr>
+          <w:rFonts w:ascii="Palatino  " w:hAnsi="Palatino  "/>
+          <w:b/>
+          <w:bCs/>
+          <w:sz w:val="19"/>
+          <w:szCs w:val="19"/>
+          <w:shd w:fill="auto" w:val="clear"/>
+        </w:rPr>
+        <w:t>Marge de millora de les validacions.</w:t>
+      </w:r>
+      <w:r>
+        <w:rPr>
+          <w:rFonts w:ascii="Palatino  " w:hAnsi="Palatino  "/>
+          <w:sz w:val="19"/>
+          <w:szCs w:val="19"/>
+          <w:shd w:fill="auto" w:val="clear"/>
+        </w:rPr>
+        <w:t xml:space="preserve"> La validació de gènere utilitza gender_guesser [14], una llibreria basada en noms d'anglès amb precisió limitada per a noms d'altres llengües. La detecció de duplicats és exacta per nom complet però no detecta duplicats parcials sense fuzzy matching a nivell de registre.</w:t>
+      </w:r>
+    </w:p>
+    <w:p>
+      <w:pPr>
+        <w:pStyle w:val="Normal"/>
+        <w:rPr>
+          <w:shd w:fill="auto" w:val="clear"/>
+        </w:rPr>
+      </w:pPr>
+      <w:r>
+        <w:rPr>
+          <w:rFonts w:ascii="Palatino  " w:hAnsi="Palatino  "/>
+          <w:b/>
+          <w:bCs/>
+          <w:sz w:val="19"/>
+          <w:szCs w:val="19"/>
+          <w:shd w:fill="auto" w:val="clear"/>
+        </w:rPr>
+        <w:t>Dependència de formats fixes.</w:t>
+      </w:r>
+      <w:r>
+        <w:rPr>
+          <w:rFonts w:ascii="Palatino  " w:hAnsi="Palatino  "/>
+          <w:sz w:val="19"/>
+          <w:szCs w:val="19"/>
+          <w:shd w:fill="auto" w:val="clear"/>
+        </w:rPr>
+        <w:t xml:space="preserve"> El sistema assumeix que els fitxers d'entrada tenen l'estructura de columnes esperada. Si una font canvia el format d'exportació, el pipeline pot fallar sense missatges d'error clars. No hi ha un mecanisme de validació d'esquema previ ni de tolerància a canvis de format.</w:t>
+      </w:r>
+    </w:p>
+    <w:p>
+      <w:pPr>
+        <w:pStyle w:val="Normal"/>
+        <w:rPr>
+          <w:shd w:fill="auto" w:val="clear"/>
+        </w:rPr>
+      </w:pPr>
+      <w:r>
+        <w:rPr>
+          <w:rFonts w:ascii="Palatino  " w:hAnsi="Palatino  "/>
+          <w:b/>
+          <w:bCs/>
+          <w:sz w:val="19"/>
+          <w:szCs w:val="19"/>
+          <w:shd w:fill="auto" w:val="clear"/>
+        </w:rPr>
+        <w:t>Escalabilitat limitada.</w:t>
+      </w:r>
+      <w:r>
+        <w:rPr>
+          <w:rFonts w:ascii="Palatino  " w:hAnsi="Palatino  "/>
+          <w:sz w:val="19"/>
+          <w:szCs w:val="19"/>
+          <w:shd w:fill="auto" w:val="clear"/>
+        </w:rPr>
+        <w:t xml:space="preserve"> El pipeline processa les dades en memòria (pandas DataFrames), cosa que limita el volum màxim al disponible en RAM. Per a fitxers amb centenars de milers de registres, caldria implementar processament per chunks o migrar a tecnologies com Apache Spark o Dask/polars out-of-core.</w:t>
+      </w:r>
+    </w:p>
+    <w:p>
+      <w:pPr>
+        <w:pStyle w:val="Normal"/>
+        <w:rPr>
+          <w:shd w:fill="auto" w:val="clear"/>
+        </w:rPr>
+      </w:pPr>
+      <w:r>
+        <w:rPr>
+          <w:rFonts w:ascii="Palatino  " w:hAnsi="Palatino  "/>
+          <w:b/>
+          <w:bCs/>
+          <w:sz w:val="19"/>
+          <w:szCs w:val="19"/>
+          <w:shd w:fill="auto" w:val="clear"/>
+        </w:rPr>
+        <w:t>Intervenció manual requerida</w:t>
+      </w:r>
+      <w:r>
+        <w:rPr>
+          <w:rFonts w:ascii="Palatino  " w:hAnsi="Palatino  "/>
+          <w:sz w:val="19"/>
+          <w:szCs w:val="19"/>
+          <w:shd w:fill="auto" w:val="clear"/>
+        </w:rPr>
+        <w:t>. El punt de pausa per a la revisió d'incidències, tot i garantir la qualitat humana, suposa un punt de bloqueig en el flux automàtic. Per a execucions amb milers de registres, aquest pas pot ser costós en temps. Es proposa com a treball futur l'aprovació automàtica de registres amb un nivell de confiança alt (per exemple, coincidències de fuzzy matching [15] superiors al 95%), reduint la càrrega de revisió manual als casos realment ambigus.</w:t>
+      </w:r>
+    </w:p>
+    <w:p>
+      <w:pPr>
+        <w:pStyle w:val="ReferenceHead"/>
+        <w:jc w:val="left"/>
+        <w:rPr>
+          <w:shd w:fill="auto" w:val="clear"/>
+        </w:rPr>
+      </w:pPr>
+      <w:r>
+        <w:rPr>
+          <w:rFonts w:ascii="Helvetica" w:hAnsi="Helvetica"/>
+          <w:b/>
+          <w:bCs/>
+          <w:color w:val="000000"/>
+          <w:sz w:val="22"/>
+          <w:shd w:fill="auto" w:val="clear"/>
+          <w:lang w:val="ca-ES"/>
+        </w:rPr>
+        <w:t>Agraïments</w:t>
+      </w:r>
+    </w:p>
+    <w:p>
+      <w:pPr>
+        <w:pStyle w:val="Cuerpodetexto"/>
+        <w:spacing w:lineRule="auto" w:line="240"/>
+        <w:rPr>
+          <w:shd w:fill="auto" w:val="clear"/>
+        </w:rPr>
+      </w:pPr>
+      <w:r>
+        <w:rPr>
+          <w:color w:val="000000"/>
+          <w:shd w:fill="auto" w:val="clear"/>
+          <w:lang w:val="ca-ES"/>
+        </w:rPr>
+        <w:t xml:space="preserve">En primer lloc, vull expressar el meu sincer agraïment al meu tutor de projecte, Daniel Franco, pel seu guiatge, paciència i suport constant al llarg del desenvolupament d'aquest Treball de Final de Grau. Els seus consells tècnics i la seva visió estratègica han estat claus per modelar l'enfocament d'aquest </w:t>
+      </w:r>
+      <w:r>
+        <w:rPr>
+          <w:i/>
+          <w:color w:val="000000"/>
+          <w:shd w:fill="auto" w:val="clear"/>
+          <w:lang w:val="ca-ES"/>
+        </w:rPr>
+        <w:t>pipeline</w:t>
+      </w:r>
+      <w:r>
+        <w:rPr>
+          <w:color w:val="000000"/>
+          <w:shd w:fill="auto" w:val="clear"/>
+          <w:lang w:val="ca-ES"/>
+        </w:rPr>
+        <w:t xml:space="preserve"> ETL.</w:t>
       </w:r>
     </w:p>
     <w:p>
@@ -8474,14 +7577,22 @@
           <w:em w:val="none"/>
           <w:lang w:val="en-US" w:eastAsia="en-US" w:bidi="ar-SA"/>
         </w:rPr>
-        <w:t xml:space="preserve">També </w:t>
-      </w:r>
-      <w:r>
-        <w:rPr>
-          <w:shd w:fill="auto" w:val="clear"/>
-        </w:rPr>
-        <w:t xml:space="preserve">vull agrair profundament l'oportunitat i el suport rebut </w:t>
-      </w:r>
+        <w:t>V</w:t>
+      </w:r>
+      <w:r>
+        <w:rPr>
+          <w:shd w:fill="auto" w:val="clear"/>
+        </w:rPr>
+        <w:t>ull estendre aquest agraïment a la Universitat Autònoma de Barcelona (UAB) i a tot el cos docent del grau en Enginyeria de Dades, per haver-me proporcionat les bases teòriques i pràctiques necessàries per afrontar un projecte d'aquestes característiques.</w:t>
+      </w:r>
+    </w:p>
+    <w:p>
+      <w:pPr>
+        <w:pStyle w:val="Cuerpodetexto"/>
+        <w:rPr>
+          <w:shd w:fill="auto" w:val="clear"/>
+        </w:rPr>
+      </w:pPr>
       <w:r>
         <w:rPr>
           <w:rFonts w:eastAsia="Times New Roman" w:cs="Times New Roman"/>
@@ -8510,6 +7621,42 @@
           <w:em w:val="none"/>
           <w:lang w:val="en-US" w:eastAsia="en-US" w:bidi="ar-SA"/>
         </w:rPr>
+        <w:t xml:space="preserve">També </w:t>
+      </w:r>
+      <w:r>
+        <w:rPr>
+          <w:shd w:fill="auto" w:val="clear"/>
+        </w:rPr>
+        <w:t xml:space="preserve">vull agrair profundament l'oportunitat i el suport rebut </w:t>
+      </w:r>
+      <w:r>
+        <w:rPr>
+          <w:rFonts w:eastAsia="Times New Roman" w:cs="Times New Roman"/>
+          <w:b w:val="false"/>
+          <w:bCs w:val="false"/>
+          <w:i w:val="false"/>
+          <w:iCs w:val="false"/>
+          <w:caps w:val="false"/>
+          <w:smallCaps w:val="false"/>
+          <w:strike w:val="false"/>
+          <w:dstrike w:val="false"/>
+          <w:outline w:val="false"/>
+          <w:emboss w:val="false"/>
+          <w:imprint w:val="false"/>
+          <w:color w:val="000000"/>
+          <w:spacing w:val="0"/>
+          <w:w w:val="100"/>
+          <w:kern w:val="2"/>
+          <w:position w:val="0"/>
+          <w:sz w:val="19"/>
+          <w:sz w:val="19"/>
+          <w:szCs w:val="20"/>
+          <w:u w:val="none"/>
+          <w:shd w:fill="auto" w:val="clear"/>
+          <w:vertAlign w:val="baseline"/>
+          <w:em w:val="none"/>
+          <w:lang w:val="en-US" w:eastAsia="en-US" w:bidi="ar-SA"/>
+        </w:rPr>
         <w:t>durant la meva estada a SAP</w:t>
       </w:r>
       <w:r>
@@ -8537,6 +7684,7 @@
       <w:pPr>
         <w:pStyle w:val="PARAGRAPH"/>
         <w:spacing w:lineRule="auto" w:line="240"/>
+        <w:ind w:left="0" w:right="0" w:hanging="0"/>
         <w:rPr>
           <w:shd w:fill="auto" w:val="clear"/>
         </w:rPr>
@@ -9349,7 +8497,7 @@
       <w:pPr>
         <w:pStyle w:val="References"/>
         <w:rPr>
-          <w:shd w:fill="FFFF00" w:val="clear"/>
+          <w:shd w:fill="auto" w:val="clear"/>
         </w:rPr>
       </w:pPr>
       <w:r>
@@ -9359,7 +8507,7 @@
           <w:bCs/>
           <w:color w:val="000000"/>
           <w:sz w:val="22"/>
-          <w:shd w:fill="FFFF00" w:val="clear"/>
+          <w:shd w:fill="auto" w:val="clear"/>
           <w:lang w:val="ca-ES"/>
         </w:rPr>
         <w:t>APÈNDIX</w:t>
@@ -9370,12 +8518,12 @@
         <w:pStyle w:val="Ttulo1"/>
         <w:ind w:left="320" w:right="0" w:hanging="320"/>
         <w:rPr>
-          <w:shd w:fill="FFFF00" w:val="clear"/>
-        </w:rPr>
-      </w:pPr>
-      <w:r>
-        <w:rPr>
-          <w:shd w:fill="FFFF00" w:val="clear"/>
+          <w:shd w:fill="auto" w:val="clear"/>
+        </w:rPr>
+      </w:pPr>
+      <w:r>
+        <w:rPr>
+          <w:shd w:fill="auto" w:val="clear"/>
         </w:rPr>
         <w:t>A1. Claus del diccionari CONFIG</w:t>
       </w:r>
@@ -9385,13 +8533,13 @@
         <w:pStyle w:val="PARAGRAPHnoindent"/>
         <w:spacing w:lineRule="auto" w:line="240"/>
         <w:rPr>
-          <w:shd w:fill="FFFF00" w:val="clear"/>
-        </w:rPr>
-      </w:pPr>
-      <w:r>
-        <w:rPr>
-          <w:color w:val="000000"/>
-          <w:shd w:fill="FFFF00" w:val="clear"/>
+          <w:shd w:fill="auto" w:val="clear"/>
+        </w:rPr>
+      </w:pPr>
+      <w:r>
+        <w:rPr>
+          <w:color w:val="000000"/>
+          <w:shd w:fill="auto" w:val="clear"/>
           <w:lang w:val="ca-ES"/>
         </w:rPr>
         <w:t>Cada script de les Parts 2, 3 i 4 defineix un diccionari CONFIG amb les claus següents: source_label (nom de la font), prospect_id_prefix (O/Z/L), reader (csv o xlsx), sheet (full de l’Excel), filter_verified (Part 4), rename_cols, desired_columns, columns_to_delete, merge_strategy (custom_id / zi_fallback / company_name), filter_same_country, convert_country, convert_account_country, format_phones, validation – include_bad_gender / include_bad_country, optional_inputs, issue_cols, prospects_output, drop_from_prospects_export, deliverable_extra_cols i source_from_zi.</w:t>
@@ -9402,7 +8550,7 @@
         <w:pStyle w:val="ReferenceHead"/>
         <w:jc w:val="left"/>
         <w:rPr>
-          <w:shd w:fill="FFFF00" w:val="clear"/>
+          <w:shd w:fill="auto" w:val="clear"/>
         </w:rPr>
       </w:pPr>
       <w:r>
@@ -9412,7 +8560,7 @@
           <w:bCs/>
           <w:color w:val="000000"/>
           <w:sz w:val="22"/>
-          <w:shd w:fill="FFFF00" w:val="clear"/>
+          <w:shd w:fill="auto" w:val="clear"/>
           <w:lang w:val="ca-ES"/>
         </w:rPr>
         <w:t>A2. Convencions de nomenclatura dels fitxers</w:t>
@@ -9424,13 +8572,13 @@
         <w:spacing w:lineRule="auto" w:line="240"/>
         <w:ind w:left="0" w:right="0" w:hanging="0"/>
         <w:rPr>
-          <w:shd w:fill="FFFF00" w:val="clear"/>
-        </w:rPr>
-      </w:pPr>
-      <w:r>
-        <w:rPr>
-          <w:color w:val="000000"/>
-          <w:shd w:fill="FFFF00" w:val="clear"/>
+          <w:shd w:fill="auto" w:val="clear"/>
+        </w:rPr>
+      </w:pPr>
+      <w:r>
+        <w:rPr>
+          <w:color w:val="000000"/>
+          <w:shd w:fill="auto" w:val="clear"/>
           <w:lang w:val="ca-ES"/>
         </w:rPr>
         <w:t>Prefix Nom_Tag compartit (p.ex. John_BLITZ). Sufixos: Nom_Tag_Accounts.xlsx (entrada Part 1), Nom_Tag_Accounts.csv (sortida Part_1), Nom_Tag_Outreach.csv / ZI.csv / LG.xlsx (exportacions de les fonts), Nom_Tag_Prospect_Issues.xlsx (revisió manual), Nom_Tag_Outreach_Prospects.xlsx, Nom_Tag_ZI_Prospects.xlsx, Nom_Tag_LG_Prospects.xlsx, Nom_Tag_Deliverable.xlsx, Nom_Tag_Emails.csv, Nom_Tag_Accounts_with_Insufficient_Prospects.csv, Nom_Tag_Prospect_Upload.csv (Part 5, només si hi ha dades manuals).</w:t>
@@ -9443,7 +8591,7 @@
         <w:ind w:left="0" w:right="0" w:hanging="0"/>
         <w:jc w:val="left"/>
         <w:rPr>
-          <w:shd w:fill="FFFF00" w:val="clear"/>
+          <w:shd w:fill="auto" w:val="clear"/>
         </w:rPr>
       </w:pPr>
       <w:r>
@@ -9453,7 +8601,7 @@
           <w:bCs/>
           <w:color w:val="000000"/>
           <w:sz w:val="22"/>
-          <w:shd w:fill="FFFF00" w:val="clear"/>
+          <w:shd w:fill="auto" w:val="clear"/>
           <w:lang w:val="ca-ES"/>
         </w:rPr>
         <w:t xml:space="preserve">A3. </w:t>
@@ -9480,7 +8628,7 @@
           <w:sz w:val="22"/>
           <w:szCs w:val="20"/>
           <w:u w:val="none"/>
-          <w:shd w:fill="FFFF00" w:val="clear"/>
+          <w:shd w:fill="auto" w:val="clear"/>
           <w:vertAlign w:val="baseline"/>
           <w:em w:val="none"/>
           <w:lang w:val="ca-ES" w:eastAsia="en-US" w:bidi="ar-SA"/>
@@ -9495,7 +8643,7 @@
         <w:ind w:left="0" w:right="0" w:hanging="0"/>
         <w:jc w:val="left"/>
         <w:rPr>
-          <w:shd w:fill="FFFF00" w:val="clear"/>
+          <w:shd w:fill="auto" w:val="clear"/>
         </w:rPr>
       </w:pPr>
       <w:r>
@@ -9520,7 +8668,7 @@
           <w:sz w:val="22"/>
           <w:szCs w:val="20"/>
           <w:u w:val="none"/>
-          <w:shd w:fill="FFFF00" w:val="clear"/>
+          <w:shd w:fill="auto" w:val="clear"/>
           <w:vertAlign w:val="baseline"/>
           <w:em w:val="none"/>
           <w:lang w:val="ca-ES" w:eastAsia="en-US" w:bidi="ar-SA"/>
@@ -9535,7 +8683,7 @@
         <w:ind w:left="0" w:right="0" w:hanging="0"/>
         <w:jc w:val="left"/>
         <w:rPr>
-          <w:shd w:fill="FFFF00" w:val="clear"/>
+          <w:shd w:fill="auto" w:val="clear"/>
         </w:rPr>
       </w:pPr>
       <w:r>
@@ -9607,7 +8755,7 @@
           <w:sz w:val="22"/>
           <w:szCs w:val="20"/>
           <w:u w:val="none"/>
-          <w:shd w:fill="FFFF00" w:val="clear"/>
+          <w:shd w:fill="auto" w:val="clear"/>
           <w:vertAlign w:val="baseline"/>
           <w:em w:val="none"/>
           <w:lang w:val="ca-ES" w:eastAsia="en-US" w:bidi="ar-SA"/>
@@ -9636,7 +8784,7 @@
           <w:sz w:val="22"/>
           <w:szCs w:val="20"/>
           <w:u w:val="none"/>
-          <w:shd w:fill="FFFF00" w:val="clear"/>
+          <w:shd w:fill="auto" w:val="clear"/>
           <w:vertAlign w:val="baseline"/>
           <w:em w:val="none"/>
           <w:lang w:val="ca-ES" w:eastAsia="en-US" w:bidi="ar-SA"/>
@@ -9651,12 +8799,12 @@
         <w:ind w:left="0" w:right="0" w:hanging="0"/>
         <w:jc w:val="left"/>
         <w:rPr>
-          <w:shd w:fill="FFFF00" w:val="clear"/>
-        </w:rPr>
-      </w:pPr>
-      <w:r>
-        <w:rPr>
-          <w:shd w:fill="FFFF00" w:val="clear"/>
+          <w:shd w:fill="auto" w:val="clear"/>
+        </w:rPr>
+      </w:pPr>
+      <w:r>
+        <w:rPr>
+          <w:shd w:fill="auto" w:val="clear"/>
         </w:rPr>
         <w:drawing>
           <wp:anchor behindDoc="0" distT="0" distB="0" distL="0" distR="0" simplePos="0" locked="0" layoutInCell="0" allowOverlap="1" relativeHeight="8">
@@ -9711,12 +8859,12 @@
         <w:spacing w:lineRule="auto" w:line="240"/>
         <w:ind w:left="0" w:right="0" w:hanging="0"/>
         <w:rPr>
-          <w:shd w:fill="FFFF00" w:val="clear"/>
-        </w:rPr>
-      </w:pPr>
-      <w:r>
-        <w:rPr>
-          <w:shd w:fill="FFFF00" w:val="clear"/>
+          <w:shd w:fill="auto" w:val="clear"/>
+        </w:rPr>
+      </w:pPr>
+      <w:r>
+        <w:rPr>
+          <w:shd w:fill="auto" w:val="clear"/>
         </w:rPr>
       </w:r>
     </w:p>
@@ -9727,7 +8875,7 @@
         <w:ind w:left="0" w:right="0" w:hanging="0"/>
         <w:jc w:val="left"/>
         <w:rPr>
-          <w:shd w:fill="FFFF00" w:val="clear"/>
+          <w:shd w:fill="auto" w:val="clear"/>
         </w:rPr>
       </w:pPr>
       <w:r>
@@ -9752,7 +8900,7 @@
           <w:sz w:val="22"/>
           <w:szCs w:val="20"/>
           <w:u w:val="none"/>
-          <w:shd w:fill="FFFF00" w:val="clear"/>
+          <w:shd w:fill="auto" w:val="clear"/>
           <w:vertAlign w:val="baseline"/>
           <w:em w:val="none"/>
           <w:lang w:val="ca-ES" w:eastAsia="en-US" w:bidi="ar-SA"/>
@@ -9767,7 +8915,7 @@
         <w:ind w:left="0" w:right="0" w:hanging="0"/>
         <w:jc w:val="left"/>
         <w:rPr>
-          <w:shd w:fill="FFFF00" w:val="clear"/>
+          <w:shd w:fill="auto" w:val="clear"/>
         </w:rPr>
       </w:pPr>
       <w:r>
@@ -9839,7 +8987,7 @@
           <w:sz w:val="22"/>
           <w:szCs w:val="20"/>
           <w:u w:val="none"/>
-          <w:shd w:fill="FFFF00" w:val="clear"/>
+          <w:shd w:fill="auto" w:val="clear"/>
           <w:vertAlign w:val="baseline"/>
           <w:em w:val="none"/>
           <w:lang w:val="ca-ES" w:eastAsia="en-US" w:bidi="ar-SA"/>
@@ -9868,7 +9016,7 @@
           <w:sz w:val="22"/>
           <w:szCs w:val="20"/>
           <w:u w:val="none"/>
-          <w:shd w:fill="FFFF00" w:val="clear"/>
+          <w:shd w:fill="auto" w:val="clear"/>
           <w:vertAlign w:val="baseline"/>
           <w:em w:val="none"/>
           <w:lang w:val="ca-ES" w:eastAsia="en-US" w:bidi="ar-SA"/>
@@ -9883,7 +9031,7 @@
         <w:ind w:left="0" w:right="0" w:hanging="0"/>
         <w:jc w:val="left"/>
         <w:rPr>
-          <w:shd w:fill="FFFF00" w:val="clear"/>
+          <w:shd w:fill="auto" w:val="clear"/>
         </w:rPr>
       </w:pPr>
       <w:r>
@@ -9955,7 +9103,7 @@
           <w:sz w:val="22"/>
           <w:szCs w:val="20"/>
           <w:u w:val="none"/>
-          <w:shd w:fill="FFFF00" w:val="clear"/>
+          <w:shd w:fill="auto" w:val="clear"/>
           <w:vertAlign w:val="baseline"/>
           <w:em w:val="none"/>
           <w:lang w:val="ca-ES" w:eastAsia="en-US" w:bidi="ar-SA"/>
@@ -9984,7 +9132,7 @@
           <w:sz w:val="22"/>
           <w:szCs w:val="20"/>
           <w:u w:val="none"/>
-          <w:shd w:fill="FFFF00" w:val="clear"/>
+          <w:shd w:fill="auto" w:val="clear"/>
           <w:vertAlign w:val="baseline"/>
           <w:em w:val="none"/>
           <w:lang w:val="ca-ES" w:eastAsia="en-US" w:bidi="ar-SA"/>
@@ -9995,17 +9143,12 @@
     <w:p>
       <w:pPr>
         <w:pStyle w:val="ReferenceHead"/>
-        <w:spacing w:lineRule="auto" w:line="240"/>
-        <w:ind w:left="0" w:right="0" w:hanging="0"/>
         <w:jc w:val="left"/>
         <w:rPr>
-          <w:shd w:fill="FFFF00" w:val="clear"/>
-        </w:rPr>
-      </w:pPr>
-      <w:r>
-        <w:rPr>
-          <w:shd w:fill="FFFF00" w:val="clear"/>
-        </w:rPr>
+          <w:shd w:fill="auto" w:val="clear"/>
+        </w:rPr>
+      </w:pPr>
+      <w:r>
         <w:drawing>
           <wp:anchor behindDoc="0" distT="0" distB="0" distL="0" distR="0" simplePos="0" locked="0" layoutInCell="0" allowOverlap="1" relativeHeight="11">
             <wp:simplePos x="0" y="0"/>
@@ -10052,6 +9195,669 @@
           </wp:anchor>
         </w:drawing>
       </w:r>
+      <w:r>
+        <w:rPr>
+          <w:rFonts w:ascii="Helvetica" w:hAnsi="Helvetica"/>
+          <w:b/>
+          <w:bCs/>
+          <w:color w:val="000000"/>
+          <w:sz w:val="22"/>
+          <w:shd w:fill="auto" w:val="clear"/>
+          <w:lang w:val="ca-ES"/>
+        </w:rPr>
+        <w:t>A</w:t>
+      </w:r>
+      <w:r>
+        <w:rPr>
+          <w:rFonts w:ascii="Helvetica" w:hAnsi="Helvetica"/>
+          <w:b/>
+          <w:bCs/>
+          <w:color w:val="000000"/>
+          <w:sz w:val="22"/>
+          <w:shd w:fill="auto" w:val="clear"/>
+          <w:lang w:val="ca-ES"/>
+        </w:rPr>
+        <w:t>4 Glossari</w:t>
+      </w:r>
+    </w:p>
+    <w:p>
+      <w:pPr>
+        <w:pStyle w:val="ReferenceHead"/>
+        <w:jc w:val="left"/>
+        <w:rPr>
+          <w:shd w:fill="auto" w:val="clear"/>
+        </w:rPr>
+      </w:pPr>
+      <w:r>
+        <w:rPr>
+          <w:rFonts w:ascii="Helvetica" w:hAnsi="Helvetica"/>
+          <w:b/>
+          <w:bCs/>
+          <w:color w:val="000000"/>
+          <w:sz w:val="22"/>
+          <w:shd w:fill="auto" w:val="clear"/>
+          <w:lang w:val="ca-ES"/>
+        </w:rPr>
+        <w:t>A4.1 Llista d’abreviatures i acrònims</w:t>
+      </w:r>
+    </w:p>
+    <w:p>
+      <w:pPr>
+        <w:pStyle w:val="Normal"/>
+        <w:numPr>
+          <w:ilvl w:val="0"/>
+          <w:numId w:val="4"/>
+        </w:numPr>
+        <w:rPr>
+          <w:shd w:fill="auto" w:val="clear"/>
+        </w:rPr>
+      </w:pPr>
+      <w:r>
+        <w:rPr>
+          <w:shd w:fill="auto" w:val="clear"/>
+        </w:rPr>
+        <w:t>ETL: Extract, Transform, Load</w:t>
+      </w:r>
+    </w:p>
+    <w:p>
+      <w:pPr>
+        <w:pStyle w:val="Normal"/>
+        <w:numPr>
+          <w:ilvl w:val="0"/>
+          <w:numId w:val="4"/>
+        </w:numPr>
+        <w:rPr>
+          <w:shd w:fill="auto" w:val="clear"/>
+        </w:rPr>
+      </w:pPr>
+      <w:r>
+        <w:rPr>
+          <w:shd w:fill="auto" w:val="clear"/>
+        </w:rPr>
+        <w:t>CRM: Customer Relationship Management</w:t>
+      </w:r>
+    </w:p>
+    <w:p>
+      <w:pPr>
+        <w:pStyle w:val="Normal"/>
+        <w:numPr>
+          <w:ilvl w:val="0"/>
+          <w:numId w:val="4"/>
+        </w:numPr>
+        <w:rPr>
+          <w:shd w:fill="auto" w:val="clear"/>
+        </w:rPr>
+      </w:pPr>
+      <w:r>
+        <w:rPr>
+          <w:shd w:fill="auto" w:val="clear"/>
+        </w:rPr>
+        <w:t xml:space="preserve">ISO: International Organization for Standardization </w:t>
+      </w:r>
+    </w:p>
+    <w:p>
+      <w:pPr>
+        <w:pStyle w:val="Normal"/>
+        <w:numPr>
+          <w:ilvl w:val="0"/>
+          <w:numId w:val="4"/>
+        </w:numPr>
+        <w:rPr>
+          <w:shd w:fill="auto" w:val="clear"/>
+        </w:rPr>
+      </w:pPr>
+      <w:r>
+        <w:rPr>
+          <w:shd w:fill="auto" w:val="clear"/>
+        </w:rPr>
+        <w:t>ITU: International Telecommunication Union</w:t>
+      </w:r>
+    </w:p>
+    <w:p>
+      <w:pPr>
+        <w:pStyle w:val="Normal"/>
+        <w:numPr>
+          <w:ilvl w:val="0"/>
+          <w:numId w:val="4"/>
+        </w:numPr>
+        <w:rPr>
+          <w:shd w:fill="auto" w:val="clear"/>
+        </w:rPr>
+      </w:pPr>
+      <w:r>
+        <w:rPr>
+          <w:shd w:fill="auto" w:val="clear"/>
+        </w:rPr>
+        <w:t>DOI: Digital Object Identifier</w:t>
+      </w:r>
+    </w:p>
+    <w:p>
+      <w:pPr>
+        <w:pStyle w:val="Normal"/>
+        <w:numPr>
+          <w:ilvl w:val="0"/>
+          <w:numId w:val="4"/>
+        </w:numPr>
+        <w:rPr>
+          <w:shd w:fill="auto" w:val="clear"/>
+        </w:rPr>
+      </w:pPr>
+      <w:r>
+        <w:rPr>
+          <w:shd w:fill="auto" w:val="clear"/>
+        </w:rPr>
+        <w:t>API: Application Programming Interface</w:t>
+      </w:r>
+    </w:p>
+    <w:p>
+      <w:pPr>
+        <w:pStyle w:val="Normal"/>
+        <w:numPr>
+          <w:ilvl w:val="0"/>
+          <w:numId w:val="4"/>
+        </w:numPr>
+        <w:rPr>
+          <w:shd w:fill="auto" w:val="clear"/>
+        </w:rPr>
+      </w:pPr>
+      <w:r>
+        <w:rPr>
+          <w:shd w:fill="auto" w:val="clear"/>
+        </w:rPr>
+        <w:t>XLSX: Microsoft XML Spreadsheet</w:t>
+      </w:r>
+    </w:p>
+    <w:p>
+      <w:pPr>
+        <w:pStyle w:val="Normal"/>
+        <w:numPr>
+          <w:ilvl w:val="0"/>
+          <w:numId w:val="4"/>
+        </w:numPr>
+        <w:rPr>
+          <w:shd w:fill="auto" w:val="clear"/>
+        </w:rPr>
+      </w:pPr>
+      <w:r>
+        <w:rPr>
+          <w:shd w:fill="auto" w:val="clear"/>
+        </w:rPr>
+        <w:t>CSV: Comma-Separated Values</w:t>
+      </w:r>
+    </w:p>
+    <w:p>
+      <w:pPr>
+        <w:pStyle w:val="Normal"/>
+        <w:numPr>
+          <w:ilvl w:val="0"/>
+          <w:numId w:val="4"/>
+        </w:numPr>
+        <w:rPr>
+          <w:shd w:fill="auto" w:val="clear"/>
+        </w:rPr>
+      </w:pPr>
+      <w:r>
+        <w:rPr>
+          <w:shd w:fill="auto" w:val="clear"/>
+        </w:rPr>
+        <w:t xml:space="preserve">DRY: Don't Repeat Yourself </w:t>
+      </w:r>
+    </w:p>
+    <w:p>
+      <w:pPr>
+        <w:pStyle w:val="Normal"/>
+        <w:numPr>
+          <w:ilvl w:val="0"/>
+          <w:numId w:val="4"/>
+        </w:numPr>
+        <w:rPr>
+          <w:shd w:fill="auto" w:val="clear"/>
+        </w:rPr>
+      </w:pPr>
+      <w:r>
+        <w:rPr>
+          <w:shd w:fill="auto" w:val="clear"/>
+        </w:rPr>
+        <w:t>CONFIG: Configuration Dictionary</w:t>
+      </w:r>
+    </w:p>
+    <w:p>
+      <w:pPr>
+        <w:pStyle w:val="Ttulo1"/>
+        <w:tabs>
+          <w:tab w:val="left" w:pos="0" w:leader="none"/>
+        </w:tabs>
+        <w:spacing w:lineRule="auto" w:line="240"/>
+        <w:ind w:left="0" w:right="0" w:hanging="0"/>
+        <w:rPr/>
+      </w:pPr>
+      <w:r>
+        <w:rPr>
+          <w:rStyle w:val="DefaultParagraphFont"/>
+          <w:color w:val="000000"/>
+          <w:shd w:fill="auto" w:val="clear"/>
+          <w:lang w:val="es-ES"/>
+        </w:rPr>
+        <w:t>A4.2 Definició de termes clau</w:t>
+      </w:r>
+    </w:p>
+    <w:p>
+      <w:pPr>
+        <w:pStyle w:val="Normal"/>
+        <w:numPr>
+          <w:ilvl w:val="0"/>
+          <w:numId w:val="3"/>
+        </w:numPr>
+        <w:tabs>
+          <w:tab w:val="clear" w:pos="720"/>
+          <w:tab w:val="left" w:pos="0" w:leader="none"/>
+        </w:tabs>
+        <w:spacing w:lineRule="auto" w:line="240"/>
+        <w:rPr>
+          <w:shd w:fill="auto" w:val="clear"/>
+        </w:rPr>
+      </w:pPr>
+      <w:r>
+        <w:rPr>
+          <w:rFonts w:ascii="Palatino   " w:hAnsi="Palatino   "/>
+          <w:sz w:val="19"/>
+          <w:szCs w:val="19"/>
+          <w:shd w:fill="auto" w:val="clear"/>
+        </w:rPr>
+        <w:t>Pipeline ETL: Conducte de dades que realitza tres fases: Extracció (lectura de fonts), Transformació (neteja, fusió, validació) i Càrrega (exportació de resultats).</w:t>
+      </w:r>
+    </w:p>
+    <w:p>
+      <w:pPr>
+        <w:pStyle w:val="Normal"/>
+        <w:numPr>
+          <w:ilvl w:val="0"/>
+          <w:numId w:val="3"/>
+        </w:numPr>
+        <w:tabs>
+          <w:tab w:val="clear" w:pos="720"/>
+          <w:tab w:val="left" w:pos="0" w:leader="none"/>
+        </w:tabs>
+        <w:spacing w:lineRule="auto" w:line="240"/>
+        <w:rPr>
+          <w:shd w:fill="auto" w:val="clear"/>
+        </w:rPr>
+      </w:pPr>
+      <w:r>
+        <w:rPr>
+          <w:rFonts w:ascii="Palatino   " w:hAnsi="Palatino   "/>
+          <w:sz w:val="19"/>
+          <w:szCs w:val="19"/>
+          <w:shd w:fill="auto" w:val="clear"/>
+        </w:rPr>
+        <w:t>Prospecte: Registre d'un contacte comercial potencial, amb dades com nom, empresa, correu electrònic i telèfon, entre altres.</w:t>
+      </w:r>
+    </w:p>
+    <w:p>
+      <w:pPr>
+        <w:pStyle w:val="Normal"/>
+        <w:numPr>
+          <w:ilvl w:val="0"/>
+          <w:numId w:val="3"/>
+        </w:numPr>
+        <w:tabs>
+          <w:tab w:val="clear" w:pos="720"/>
+          <w:tab w:val="left" w:pos="0" w:leader="none"/>
+        </w:tabs>
+        <w:spacing w:lineRule="auto" w:line="240"/>
+        <w:rPr>
+          <w:shd w:fill="auto" w:val="clear"/>
+        </w:rPr>
+      </w:pPr>
+      <w:r>
+        <w:rPr>
+          <w:rFonts w:ascii="Palatino   " w:hAnsi="Palatino   "/>
+          <w:sz w:val="19"/>
+          <w:szCs w:val="19"/>
+          <w:shd w:fill="auto" w:val="clear"/>
+        </w:rPr>
+        <w:t>Merge Strategy: Estrègia per enllaçar prospectes amb els seus comptes. Tres variants: custom_id (per ID directe), zi_fallback (Custom Id → Website → Query Name) i company_name (per nom d'empresa).</w:t>
+      </w:r>
+    </w:p>
+    <w:p>
+      <w:pPr>
+        <w:pStyle w:val="Normal"/>
+        <w:numPr>
+          <w:ilvl w:val="0"/>
+          <w:numId w:val="3"/>
+        </w:numPr>
+        <w:tabs>
+          <w:tab w:val="clear" w:pos="720"/>
+          <w:tab w:val="left" w:pos="0" w:leader="none"/>
+        </w:tabs>
+        <w:spacing w:lineRule="auto" w:line="240"/>
+        <w:rPr>
+          <w:shd w:fill="auto" w:val="clear"/>
+        </w:rPr>
+      </w:pPr>
+      <w:r>
+        <w:rPr>
+          <w:rFonts w:ascii="Palatino   " w:hAnsi="Palatino   "/>
+          <w:sz w:val="19"/>
+          <w:szCs w:val="19"/>
+          <w:shd w:fill="auto" w:val="clear"/>
+        </w:rPr>
+        <w:t>Deliverable: Fitxer de lliurament final (xlsx) que conté els prospectes enriquits i validats, preparat per a la importació al CRM.</w:t>
+      </w:r>
+    </w:p>
+    <w:p>
+      <w:pPr>
+        <w:pStyle w:val="Normal"/>
+        <w:numPr>
+          <w:ilvl w:val="0"/>
+          <w:numId w:val="3"/>
+        </w:numPr>
+        <w:tabs>
+          <w:tab w:val="clear" w:pos="720"/>
+          <w:tab w:val="left" w:pos="0" w:leader="none"/>
+        </w:tabs>
+        <w:spacing w:lineRule="auto" w:line="240"/>
+        <w:rPr>
+          <w:shd w:fill="auto" w:val="clear"/>
+        </w:rPr>
+      </w:pPr>
+      <w:r>
+        <w:rPr>
+          <w:rFonts w:ascii="Palatino   " w:hAnsi="Palatino   "/>
+          <w:sz w:val="19"/>
+          <w:szCs w:val="19"/>
+          <w:shd w:fill="auto" w:val="clear"/>
+        </w:rPr>
+        <w:t>Dummy: Registre fictici en la llista de comptes que no correspon a una empresa real. S'identifica pel camp 'Account Name' que conté la paraula 'dummy'.</w:t>
+      </w:r>
+    </w:p>
+    <w:p>
+      <w:pPr>
+        <w:pStyle w:val="Normal"/>
+        <w:numPr>
+          <w:ilvl w:val="0"/>
+          <w:numId w:val="3"/>
+        </w:numPr>
+        <w:tabs>
+          <w:tab w:val="clear" w:pos="720"/>
+          <w:tab w:val="left" w:pos="0" w:leader="none"/>
+        </w:tabs>
+        <w:spacing w:lineRule="auto" w:line="240"/>
+        <w:rPr>
+          <w:shd w:fill="auto" w:val="clear"/>
+        </w:rPr>
+      </w:pPr>
+      <w:r>
+        <w:rPr>
+          <w:rFonts w:ascii="Palatino   " w:hAnsi="Palatino   "/>
+          <w:sz w:val="19"/>
+          <w:szCs w:val="19"/>
+          <w:shd w:fill="auto" w:val="clear"/>
+        </w:rPr>
+        <w:t>Threshold: Nombre màxim de prospectes permesos per compte. Els registres que superen aquest llindar es marquen com 'Extra'.</w:t>
+      </w:r>
+    </w:p>
+    <w:p>
+      <w:pPr>
+        <w:pStyle w:val="Normal"/>
+        <w:numPr>
+          <w:ilvl w:val="0"/>
+          <w:numId w:val="3"/>
+        </w:numPr>
+        <w:tabs>
+          <w:tab w:val="clear" w:pos="720"/>
+          <w:tab w:val="left" w:pos="0" w:leader="none"/>
+        </w:tabs>
+        <w:spacing w:lineRule="auto" w:line="240"/>
+        <w:rPr>
+          <w:shd w:fill="auto" w:val="clear"/>
+        </w:rPr>
+      </w:pPr>
+      <w:r>
+        <w:rPr>
+          <w:rFonts w:ascii="Palatino   " w:hAnsi="Palatino   "/>
+          <w:sz w:val="19"/>
+          <w:szCs w:val="19"/>
+          <w:shd w:fill="auto" w:val="clear"/>
+        </w:rPr>
+        <w:t>CONFIG: Diccionari de configuració que defineix tots els paràmetres específics de cada font de dades (noms de co</w:t>
+      </w:r>
+      <w:r>
+        <w:rPr>
+          <w:rFonts w:ascii="Palatino   " w:hAnsi="Palatino   "/>
+          <w:b w:val="false"/>
+          <w:bCs w:val="false"/>
+          <w:sz w:val="19"/>
+          <w:szCs w:val="19"/>
+          <w:shd w:fill="auto" w:val="clear"/>
+        </w:rPr>
+        <w:t>lumnes, estratègia de fusió, filtres, validacions).</w:t>
+      </w:r>
+    </w:p>
+    <w:p>
+      <w:pPr>
+        <w:pStyle w:val="Normal"/>
+        <w:numPr>
+          <w:ilvl w:val="0"/>
+          <w:numId w:val="3"/>
+        </w:numPr>
+        <w:tabs>
+          <w:tab w:val="clear" w:pos="720"/>
+          <w:tab w:val="left" w:pos="0" w:leader="none"/>
+        </w:tabs>
+        <w:spacing w:lineRule="auto" w:line="240"/>
+        <w:ind w:left="0" w:right="0" w:hanging="0"/>
+        <w:jc w:val="left"/>
+        <w:rPr>
+          <w:shd w:fill="auto" w:val="clear"/>
+        </w:rPr>
+      </w:pPr>
+      <w:r>
+        <w:rPr>
+          <w:rFonts w:ascii="Palatino   " w:hAnsi="Palatino   "/>
+          <w:b w:val="false"/>
+          <w:bCs w:val="false"/>
+          <w:color w:val="000000"/>
+          <w:sz w:val="19"/>
+          <w:szCs w:val="19"/>
+          <w:shd w:fill="auto" w:val="clear"/>
+          <w:lang w:val="ca-ES"/>
+        </w:rPr>
+        <w:t>Prospect ID: Identificador únic assignat a cada prospecte amb format PREFIX + número de 4 dígits (p.ex. Z0001).</w:t>
+      </w:r>
+    </w:p>
+    <w:p>
+      <w:pPr>
+        <w:pStyle w:val="Ttulo1"/>
+        <w:tabs>
+          <w:tab w:val="left" w:pos="0" w:leader="none"/>
+        </w:tabs>
+        <w:spacing w:lineRule="auto" w:line="240"/>
+        <w:ind w:left="0" w:right="0" w:hanging="0"/>
+        <w:jc w:val="left"/>
+        <w:rPr>
+          <w:shd w:fill="auto" w:val="clear"/>
+        </w:rPr>
+      </w:pPr>
+      <w:r>
+        <w:rPr>
+          <w:rStyle w:val="DefaultParagraphFont"/>
+          <w:color w:val="000000"/>
+          <w:shd w:fill="auto" w:val="clear"/>
+          <w:lang w:val="es-ES"/>
+        </w:rPr>
+        <w:t>A</w:t>
+      </w:r>
+      <w:r>
+        <w:rPr>
+          <w:rStyle w:val="DefaultParagraphFont"/>
+          <w:color w:val="000000"/>
+          <w:shd w:fill="auto" w:val="clear"/>
+          <w:lang w:val="es-ES"/>
+        </w:rPr>
+        <w:t>5</w:t>
+      </w:r>
+      <w:r>
+        <w:rPr>
+          <w:rStyle w:val="DefaultParagraphFont"/>
+          <w:color w:val="000000"/>
+          <w:shd w:fill="auto" w:val="clear"/>
+          <w:lang w:val="es-ES"/>
+        </w:rPr>
+        <w:t xml:space="preserve"> </w:t>
+      </w:r>
+      <w:r>
+        <w:rPr>
+          <w:rStyle w:val="DefaultParagraphFont"/>
+          <w:color w:val="000000"/>
+          <w:shd w:fill="auto" w:val="clear"/>
+          <w:lang w:val="es-ES"/>
+        </w:rPr>
+        <w:t>Repositori del projecte</w:t>
+      </w:r>
+    </w:p>
+    <w:p>
+      <w:pPr>
+        <w:pStyle w:val="PARAGRAPH"/>
+        <w:tabs>
+          <w:tab w:val="clear" w:pos="720"/>
+          <w:tab w:val="left" w:pos="0" w:leader="none"/>
+        </w:tabs>
+        <w:spacing w:lineRule="auto" w:line="240"/>
+        <w:ind w:left="0" w:right="0" w:hanging="0"/>
+        <w:jc w:val="left"/>
+        <w:rPr>
+          <w:shd w:fill="auto" w:val="clear"/>
+        </w:rPr>
+      </w:pPr>
+      <w:r>
+        <w:rPr>
+          <w:rStyle w:val="DefaultParagraphFont"/>
+          <w:color w:val="000000"/>
+          <w:shd w:fill="auto" w:val="clear"/>
+          <w:lang w:val="es-ES"/>
+        </w:rPr>
+        <w:t xml:space="preserve">El codi font complet desenvolupat durant aquest treball es troba disponible al següent repositori GitHub: </w:t>
+      </w:r>
+      <w:hyperlink r:id="rId18">
+        <w:r>
+          <w:rPr>
+            <w:rStyle w:val="EnlacedeInternet"/>
+            <w:color w:val="000000"/>
+            <w:shd w:fill="auto" w:val="clear"/>
+            <w:lang w:val="es-ES"/>
+          </w:rPr>
+          <w:t>https://github.com/dxnetft/etl-prospecting-pipeline</w:t>
+        </w:r>
+      </w:hyperlink>
+      <w:r>
+        <w:rPr>
+          <w:rStyle w:val="DefaultParagraphFont"/>
+          <w:color w:val="000000"/>
+          <w:shd w:fill="auto" w:val="clear"/>
+          <w:lang w:val="es-ES"/>
+        </w:rPr>
+        <w:br/>
+        <w:t>Per motius de confidencialitat empresarial, el</w:t>
+      </w:r>
+      <w:r>
+        <w:rPr>
+          <w:rStyle w:val="DefaultParagraphFont"/>
+          <w:rFonts w:eastAsia="Times New Roman" w:cs="Times New Roman"/>
+          <w:b w:val="false"/>
+          <w:bCs w:val="false"/>
+          <w:i w:val="false"/>
+          <w:iCs w:val="false"/>
+          <w:caps w:val="false"/>
+          <w:smallCaps w:val="false"/>
+          <w:strike w:val="false"/>
+          <w:dstrike w:val="false"/>
+          <w:outline w:val="false"/>
+          <w:emboss w:val="false"/>
+          <w:imprint w:val="false"/>
+          <w:color w:val="000000"/>
+          <w:spacing w:val="0"/>
+          <w:w w:val="100"/>
+          <w:kern w:val="2"/>
+          <w:position w:val="0"/>
+          <w:sz w:val="19"/>
+          <w:sz w:val="19"/>
+          <w:szCs w:val="20"/>
+          <w:u w:val="none"/>
+          <w:shd w:fill="auto" w:val="clear"/>
+          <w:vertAlign w:val="baseline"/>
+          <w:em w:val="none"/>
+          <w:lang w:val="es-ES" w:eastAsia="en-US" w:bidi="ar-SA"/>
+        </w:rPr>
+        <w:t>s arxius de dades</w:t>
+      </w:r>
+      <w:r>
+        <w:rPr>
+          <w:rStyle w:val="DefaultParagraphFont"/>
+          <w:color w:val="000000"/>
+          <w:shd w:fill="auto" w:val="clear"/>
+          <w:lang w:val="es-ES"/>
+        </w:rPr>
+        <w:t xml:space="preserve"> no es distribueixen públicament. </w:t>
+        <w:br/>
+        <w:br/>
+        <w:br/>
+        <w:t xml:space="preserve"> </w:t>
+      </w:r>
+    </w:p>
+    <w:p>
+      <w:pPr>
+        <w:pStyle w:val="Normal"/>
+        <w:tabs>
+          <w:tab w:val="clear" w:pos="720"/>
+          <w:tab w:val="left" w:pos="0" w:leader="none"/>
+        </w:tabs>
+        <w:spacing w:lineRule="auto" w:line="240"/>
+        <w:ind w:left="0" w:right="0" w:hanging="0"/>
+        <w:jc w:val="left"/>
+        <w:rPr>
+          <w:shd w:fill="auto" w:val="clear"/>
+        </w:rPr>
+      </w:pPr>
+      <w:r>
+        <w:rPr/>
+      </w:r>
+    </w:p>
+    <w:p>
+      <w:pPr>
+        <w:pStyle w:val="Normal"/>
+        <w:tabs>
+          <w:tab w:val="clear" w:pos="720"/>
+          <w:tab w:val="left" w:pos="0" w:leader="none"/>
+        </w:tabs>
+        <w:spacing w:lineRule="auto" w:line="240"/>
+        <w:ind w:left="0" w:right="0" w:hanging="0"/>
+        <w:jc w:val="left"/>
+        <w:rPr>
+          <w:shd w:fill="auto" w:val="clear"/>
+        </w:rPr>
+      </w:pPr>
+      <w:r>
+        <w:rPr/>
+      </w:r>
+    </w:p>
+    <w:p>
+      <w:pPr>
+        <w:pStyle w:val="Normal"/>
+        <w:tabs>
+          <w:tab w:val="clear" w:pos="720"/>
+          <w:tab w:val="left" w:pos="0" w:leader="none"/>
+        </w:tabs>
+        <w:spacing w:lineRule="auto" w:line="240"/>
+        <w:ind w:left="0" w:right="0" w:hanging="0"/>
+        <w:jc w:val="left"/>
+        <w:rPr>
+          <w:shd w:fill="auto" w:val="clear"/>
+        </w:rPr>
+      </w:pPr>
+      <w:r>
+        <w:rPr/>
+      </w:r>
     </w:p>
     <w:p>
       <w:pPr>
@@ -10060,28 +9866,12 @@
         <w:ind w:left="0" w:right="0" w:hanging="0"/>
         <w:jc w:val="left"/>
         <w:rPr>
-          <w:shd w:fill="FFFF00" w:val="clear"/>
-        </w:rPr>
-      </w:pPr>
-      <w:r>
-        <w:rPr>
-          <w:shd w:fill="FFFF00" w:val="clear"/>
-        </w:rPr>
-      </w:r>
-    </w:p>
-    <w:p>
-      <w:pPr>
-        <w:pStyle w:val="ReferenceHead"/>
-        <w:spacing w:lineRule="auto" w:line="240"/>
-        <w:ind w:left="0" w:right="0" w:hanging="0"/>
-        <w:jc w:val="left"/>
-        <w:rPr>
-          <w:shd w:fill="FFFF00" w:val="clear"/>
-        </w:rPr>
-      </w:pPr>
-      <w:r>
-        <w:rPr>
-          <w:shd w:fill="FFFF00" w:val="clear"/>
+          <w:shd w:fill="auto" w:val="clear"/>
+        </w:rPr>
+      </w:pPr>
+      <w:r>
+        <w:rPr>
+          <w:shd w:fill="auto" w:val="clear"/>
         </w:rPr>
       </w:r>
     </w:p>
@@ -10091,12 +9881,12 @@
         <w:spacing w:lineRule="auto" w:line="240"/>
         <w:ind w:left="0" w:right="0" w:hanging="0"/>
         <w:rPr>
-          <w:shd w:fill="FFFF00" w:val="clear"/>
-        </w:rPr>
-      </w:pPr>
-      <w:r>
-        <w:rPr>
-          <w:shd w:fill="FFFF00" w:val="clear"/>
+          <w:shd w:fill="auto" w:val="clear"/>
+        </w:rPr>
+      </w:pPr>
+      <w:r>
+        <w:rPr>
+          <w:shd w:fill="auto" w:val="clear"/>
         </w:rPr>
       </w:r>
     </w:p>
@@ -10106,12 +9896,12 @@
         <w:spacing w:lineRule="auto" w:line="240"/>
         <w:ind w:left="0" w:right="0" w:hanging="0"/>
         <w:rPr>
-          <w:shd w:fill="FFFF00" w:val="clear"/>
-        </w:rPr>
-      </w:pPr>
-      <w:r>
-        <w:rPr>
-          <w:shd w:fill="FFFF00" w:val="clear"/>
+          <w:shd w:fill="auto" w:val="clear"/>
+        </w:rPr>
+      </w:pPr>
+      <w:r>
+        <w:rPr>
+          <w:shd w:fill="auto" w:val="clear"/>
         </w:rPr>
       </w:r>
     </w:p>
@@ -10121,12 +9911,12 @@
         <w:spacing w:lineRule="auto" w:line="240"/>
         <w:ind w:left="0" w:right="0" w:hanging="0"/>
         <w:rPr>
-          <w:shd w:fill="FFFF00" w:val="clear"/>
-        </w:rPr>
-      </w:pPr>
-      <w:r>
-        <w:rPr>
-          <w:shd w:fill="FFFF00" w:val="clear"/>
+          <w:shd w:fill="auto" w:val="clear"/>
+        </w:rPr>
+      </w:pPr>
+      <w:r>
+        <w:rPr>
+          <w:shd w:fill="auto" w:val="clear"/>
         </w:rPr>
       </w:r>
     </w:p>
@@ -10136,12 +9926,12 @@
         <w:spacing w:lineRule="auto" w:line="240"/>
         <w:ind w:left="0" w:right="0" w:hanging="0"/>
         <w:rPr>
-          <w:shd w:fill="FFFF00" w:val="clear"/>
-        </w:rPr>
-      </w:pPr>
-      <w:r>
-        <w:rPr>
-          <w:shd w:fill="FFFF00" w:val="clear"/>
+          <w:shd w:fill="auto" w:val="clear"/>
+        </w:rPr>
+      </w:pPr>
+      <w:r>
+        <w:rPr>
+          <w:shd w:fill="auto" w:val="clear"/>
         </w:rPr>
       </w:r>
     </w:p>
@@ -10151,12 +9941,12 @@
         <w:spacing w:lineRule="auto" w:line="240"/>
         <w:ind w:left="0" w:right="0" w:hanging="0"/>
         <w:rPr>
-          <w:shd w:fill="FFFF00" w:val="clear"/>
-        </w:rPr>
-      </w:pPr>
-      <w:r>
-        <w:rPr>
-          <w:shd w:fill="FFFF00" w:val="clear"/>
+          <w:shd w:fill="auto" w:val="clear"/>
+        </w:rPr>
+      </w:pPr>
+      <w:r>
+        <w:rPr>
+          <w:shd w:fill="auto" w:val="clear"/>
         </w:rPr>
       </w:r>
     </w:p>
@@ -10166,12 +9956,12 @@
         <w:spacing w:lineRule="auto" w:line="240"/>
         <w:ind w:left="0" w:right="0" w:hanging="0"/>
         <w:rPr>
-          <w:shd w:fill="FFFF00" w:val="clear"/>
-        </w:rPr>
-      </w:pPr>
-      <w:r>
-        <w:rPr>
-          <w:shd w:fill="FFFF00" w:val="clear"/>
+          <w:shd w:fill="auto" w:val="clear"/>
+        </w:rPr>
+      </w:pPr>
+      <w:r>
+        <w:rPr>
+          <w:shd w:fill="auto" w:val="clear"/>
         </w:rPr>
       </w:r>
     </w:p>
@@ -10181,12 +9971,12 @@
         <w:spacing w:lineRule="auto" w:line="240"/>
         <w:ind w:left="0" w:right="0" w:hanging="0"/>
         <w:rPr>
-          <w:shd w:fill="FFFF00" w:val="clear"/>
-        </w:rPr>
-      </w:pPr>
-      <w:r>
-        <w:rPr>
-          <w:shd w:fill="FFFF00" w:val="clear"/>
+          <w:shd w:fill="auto" w:val="clear"/>
+        </w:rPr>
+      </w:pPr>
+      <w:r>
+        <w:rPr>
+          <w:shd w:fill="auto" w:val="clear"/>
         </w:rPr>
       </w:r>
     </w:p>
@@ -10196,12 +9986,12 @@
         <w:spacing w:lineRule="auto" w:line="240"/>
         <w:ind w:left="0" w:right="0" w:hanging="0"/>
         <w:rPr>
-          <w:shd w:fill="FFFF00" w:val="clear"/>
-        </w:rPr>
-      </w:pPr>
-      <w:r>
-        <w:rPr>
-          <w:shd w:fill="FFFF00" w:val="clear"/>
+          <w:shd w:fill="auto" w:val="clear"/>
+        </w:rPr>
+      </w:pPr>
+      <w:r>
+        <w:rPr>
+          <w:shd w:fill="auto" w:val="clear"/>
         </w:rPr>
       </w:r>
     </w:p>
@@ -10211,12 +10001,12 @@
         <w:spacing w:lineRule="auto" w:line="240"/>
         <w:ind w:left="0" w:right="0" w:hanging="0"/>
         <w:rPr>
-          <w:shd w:fill="FFFF00" w:val="clear"/>
-        </w:rPr>
-      </w:pPr>
-      <w:r>
-        <w:rPr>
-          <w:shd w:fill="FFFF00" w:val="clear"/>
+          <w:shd w:fill="auto" w:val="clear"/>
+        </w:rPr>
+      </w:pPr>
+      <w:r>
+        <w:rPr>
+          <w:shd w:fill="auto" w:val="clear"/>
         </w:rPr>
       </w:r>
     </w:p>
@@ -10226,12 +10016,12 @@
         <w:spacing w:lineRule="auto" w:line="240"/>
         <w:ind w:left="0" w:right="0" w:hanging="0"/>
         <w:rPr>
-          <w:shd w:fill="FFFF00" w:val="clear"/>
-        </w:rPr>
-      </w:pPr>
-      <w:r>
-        <w:rPr>
-          <w:shd w:fill="FFFF00" w:val="clear"/>
+          <w:shd w:fill="auto" w:val="clear"/>
+        </w:rPr>
+      </w:pPr>
+      <w:r>
+        <w:rPr>
+          <w:shd w:fill="auto" w:val="clear"/>
         </w:rPr>
       </w:r>
     </w:p>
@@ -10241,12 +10031,12 @@
         <w:spacing w:lineRule="auto" w:line="240"/>
         <w:ind w:left="0" w:right="0" w:hanging="0"/>
         <w:rPr>
-          <w:shd w:fill="FFFF00" w:val="clear"/>
-        </w:rPr>
-      </w:pPr>
-      <w:r>
-        <w:rPr>
-          <w:shd w:fill="FFFF00" w:val="clear"/>
+          <w:shd w:fill="auto" w:val="clear"/>
+        </w:rPr>
+      </w:pPr>
+      <w:r>
+        <w:rPr>
+          <w:shd w:fill="auto" w:val="clear"/>
         </w:rPr>
       </w:r>
     </w:p>
@@ -10255,10 +10045,14 @@
         <w:pStyle w:val="PARAGRAPH"/>
         <w:spacing w:lineRule="auto" w:line="240"/>
         <w:ind w:left="0" w:right="0" w:hanging="0"/>
-        <w:rPr/>
-      </w:pPr>
-      <w:r>
-        <w:rPr/>
+        <w:rPr>
+          <w:shd w:fill="auto" w:val="clear"/>
+        </w:rPr>
+      </w:pPr>
+      <w:r>
+        <w:rPr>
+          <w:shd w:fill="auto" w:val="clear"/>
+        </w:rPr>
       </w:r>
     </w:p>
     <w:p>
@@ -10266,19 +10060,21 @@
         <w:pStyle w:val="PARAGRAPH"/>
         <w:spacing w:lineRule="auto" w:line="240" w:before="0" w:after="200"/>
         <w:ind w:left="0" w:right="0" w:hanging="0"/>
+        <w:rPr>
+          <w:shd w:fill="auto" w:val="clear"/>
+        </w:rPr>
+      </w:pPr>
+      <w:r>
         <w:rPr/>
-      </w:pPr>
-      <w:r>
-        <w:rPr/>
       </w:r>
     </w:p>
     <w:p>
       <w:pPr>
         <w:sectPr>
-          <w:headerReference w:type="even" r:id="rId18"/>
-          <w:headerReference w:type="default" r:id="rId19"/>
-          <w:footerReference w:type="even" r:id="rId20"/>
-          <w:footerReference w:type="default" r:id="rId21"/>
+          <w:headerReference w:type="even" r:id="rId19"/>
+          <w:headerReference w:type="default" r:id="rId20"/>
+          <w:footerReference w:type="even" r:id="rId21"/>
+          <w:footerReference w:type="default" r:id="rId22"/>
           <w:type w:val="nextPage"/>
           <w:pgSz w:w="11339" w:h="15477"/>
           <w:pgMar w:left="720" w:right="607" w:header="607" w:top="1196" w:footer="74" w:bottom="357" w:gutter="0"/>
@@ -10290,30 +10086,15 @@
         </w:sectPr>
       </w:pPr>
     </w:p>
-    <w:p>
-      <w:pPr>
-        <w:pStyle w:val="Normal"/>
-        <w:keepNext w:val="false"/>
-        <w:keepLines w:val="false"/>
-        <w:pageBreakBefore w:val="false"/>
-        <w:widowControl w:val="false"/>
-        <w:shd w:val="clear" w:fill="auto"/>
-        <w:suppressAutoHyphens w:val="false"/>
-        <w:overflowPunct w:val="true"/>
-        <w:bidi w:val="0"/>
-        <w:snapToGrid w:val="true"/>
-        <w:spacing w:lineRule="exact" w:line="230" w:before="0" w:after="200"/>
-        <w:jc w:val="both"/>
-        <w:rPr/>
-      </w:pPr>
-      <w:r>
-        <w:rPr/>
-      </w:r>
-    </w:p>
     <w:sectPr>
+      <w:headerReference w:type="even" r:id="rId23"/>
+      <w:headerReference w:type="default" r:id="rId24"/>
+      <w:footerReference w:type="even" r:id="rId25"/>
+      <w:footerReference w:type="default" r:id="rId26"/>
       <w:type w:val="continuous"/>
       <w:pgSz w:w="11339" w:h="15477"/>
       <w:pgMar w:left="720" w:right="607" w:header="607" w:top="1196" w:footer="74" w:bottom="357" w:gutter="0"/>
+      <w:pgNumType w:fmt="decimal"/>
       <w:formProt w:val="false"/>
       <w:textDirection w:val="lrTb"/>
       <w:docGrid w:type="default" w:linePitch="600" w:charSpace="42598"/>
@@ -10324,7 +10105,7 @@
 
 <file path=word/comments.xml><?xml version="1.0" encoding="utf-8"?>
 <w:comments xmlns:o="urn:schemas-microsoft-com:office:office" xmlns:r="http://schemas.openxmlformats.org/officeDocument/2006/relationships" xmlns:v="urn:schemas-microsoft-com:vml" xmlns:w="http://schemas.openxmlformats.org/wordprocessingml/2006/main" xmlns:w10="urn:schemas-microsoft-com:office:word" xmlns:wp="http://schemas.openxmlformats.org/drawingml/2006/wordprocessingDrawing" xmlns:wps="http://schemas.microsoft.com/office/word/2010/wordprocessingShape" xmlns:wpg="http://schemas.microsoft.com/office/word/2010/wordprocessingGroup" xmlns:mc="http://schemas.openxmlformats.org/markup-compatibility/2006" xmlns:wp14="http://schemas.microsoft.com/office/word/2010/wordprocessingDrawing" xmlns:w14="http://schemas.microsoft.com/office/word/2010/wordml" mc:Ignorable="w14 wp14">
-  <w:comment w:id="0" w:author="Autor desconocido" w:date="2026-06-16T22:27:00Z" w:initials="">
+  <w:comment w:id="0" w:author="Autor desconocido" w:date="2026-06-27T19:53:01Z" w:initials="">
     <w:p>
       <w:r>
         <w:rPr>
@@ -10354,255 +10135,7 @@
           <w:em w:val="none"/>
           <w:lang w:val="ca-ES" w:eastAsia="en-US" w:bidi="ar-SA"/>
         </w:rPr>
-        <w:t>El format que has posat al informe que m’has reenviat haig de posarlo? Hem de fer portada?</w:t>
-      </w:r>
-    </w:p>
-  </w:comment>
-  <w:comment w:id="1" w:author="Autor desconocido" w:date="2026-06-17T21:07:42Z" w:initials="">
-    <w:p>
-      <w:r>
-        <w:rPr>
-          <w:rFonts w:ascii="Times New Roman" w:hAnsi="Times New Roman" w:eastAsia="Times New Roman" w:cs="Times New Roman"/>
-          <w:b w:val="false"/>
-          <w:bCs w:val="false"/>
-          <w:i w:val="false"/>
-          <w:iCs w:val="false"/>
-          <w:caps w:val="false"/>
-          <w:smallCaps w:val="false"/>
-          <w:strike w:val="false"/>
-          <w:dstrike w:val="false"/>
-          <w:outline w:val="false"/>
-          <w:shadow w:val="false"/>
-          <w:emboss w:val="false"/>
-          <w:imprint w:val="false"/>
-          <w:color w:val="auto"/>
-          <w:spacing w:val="0"/>
-          <w:w w:val="100"/>
-          <w:kern w:val="0"/>
-          <w:position w:val="0"/>
-          <w:sz w:val="20"/>
-          <w:sz w:val="20"/>
-          <w:szCs w:val="20"/>
-          <w:u w:val="none"/>
-          <w:vertAlign w:val="baseline"/>
-          <w:em w:val="none"/>
-          <w:lang w:val="ca-ES" w:eastAsia="en-US" w:bidi="ar-SA"/>
-        </w:rPr>
-        <w:t>Aixo ho deixem o esborrem?</w:t>
-      </w:r>
-    </w:p>
-  </w:comment>
-  <w:comment w:id="2" w:author="Autor desconocido" w:date="2026-05-24T01:43:28Z" w:initials="">
-    <w:p>
-      <w:r>
-        <w:rPr>
-          <w:rFonts w:ascii="Times New Roman" w:hAnsi="Times New Roman" w:eastAsia="Times New Roman" w:cs="Times New Roman"/>
-          <w:b w:val="false"/>
-          <w:bCs w:val="false"/>
-          <w:i w:val="false"/>
-          <w:iCs w:val="false"/>
-          <w:caps w:val="false"/>
-          <w:smallCaps w:val="false"/>
-          <w:strike w:val="false"/>
-          <w:dstrike w:val="false"/>
-          <w:outline w:val="false"/>
-          <w:shadow w:val="false"/>
-          <w:emboss w:val="false"/>
-          <w:imprint w:val="false"/>
-          <w:color w:val="auto"/>
-          <w:spacing w:val="0"/>
-          <w:w w:val="100"/>
-          <w:kern w:val="0"/>
-          <w:position w:val="0"/>
-          <w:sz w:val="20"/>
-          <w:sz w:val="20"/>
-          <w:szCs w:val="20"/>
-          <w:u w:val="none"/>
-          <w:vertAlign w:val="baseline"/>
-          <w:em w:val="none"/>
-          <w:lang w:val="ca-ES" w:eastAsia="en-US" w:bidi="ar-SA"/>
-        </w:rPr>
-        <w:t>Fer anonimització i arreglar repo github</w:t>
-      </w:r>
-    </w:p>
-  </w:comment>
-  <w:comment w:id="3" w:author="Autor desconocido" w:date="2026-06-23T02:34:06Z" w:initials="">
-    <w:p>
-      <w:r>
-        <w:rPr>
-          <w:rFonts w:ascii="Times New Roman" w:hAnsi="Times New Roman" w:eastAsia="Times New Roman" w:cs="Times New Roman"/>
-          <w:b w:val="false"/>
-          <w:bCs w:val="false"/>
-          <w:i w:val="false"/>
-          <w:iCs w:val="false"/>
-          <w:caps w:val="false"/>
-          <w:smallCaps w:val="false"/>
-          <w:strike w:val="false"/>
-          <w:dstrike w:val="false"/>
-          <w:outline w:val="false"/>
-          <w:shadow w:val="false"/>
-          <w:emboss w:val="false"/>
-          <w:imprint w:val="false"/>
-          <w:color w:val="auto"/>
-          <w:spacing w:val="0"/>
-          <w:w w:val="100"/>
-          <w:kern w:val="0"/>
-          <w:position w:val="0"/>
-          <w:sz w:val="20"/>
-          <w:sz w:val="20"/>
-          <w:szCs w:val="20"/>
-          <w:u w:val="none"/>
-          <w:vertAlign w:val="baseline"/>
-          <w:em w:val="none"/>
-          <w:lang w:val="en-US" w:eastAsia="en-US" w:bidi="ar-SA"/>
-        </w:rPr>
-        <w:t>Posar-ho en anglès o catala? Resumir les fases? Estan totes a les imatges del apendix. Com ho posem? “Les mesures detallades de cada fase es presenten a l'Apèndix A3.”?</w:t>
-      </w:r>
-    </w:p>
-    <w:p>
-      <w:r>
-        <w:rPr>
-          <w:rFonts w:ascii="Times New Roman" w:hAnsi="Times New Roman" w:eastAsia="Times New Roman" w:cs="Times New Roman"/>
-          <w:b w:val="false"/>
-          <w:bCs w:val="false"/>
-          <w:i w:val="false"/>
-          <w:iCs w:val="false"/>
-          <w:caps w:val="false"/>
-          <w:smallCaps w:val="false"/>
-          <w:strike w:val="false"/>
-          <w:dstrike w:val="false"/>
-          <w:outline w:val="false"/>
-          <w:shadow w:val="false"/>
-          <w:emboss w:val="false"/>
-          <w:imprint w:val="false"/>
-          <w:color w:val="auto"/>
-          <w:spacing w:val="0"/>
-          <w:w w:val="100"/>
-          <w:kern w:val="0"/>
-          <w:position w:val="0"/>
-          <w:sz w:val="20"/>
-          <w:sz w:val="20"/>
-          <w:szCs w:val="20"/>
-          <w:u w:val="none"/>
-          <w:vertAlign w:val="baseline"/>
-          <w:em w:val="none"/>
-          <w:lang w:val="en-US" w:eastAsia="en-US" w:bidi="ar-SA"/>
-        </w:rPr>
-        <w:t>Fa falta que les deixi posades si ja estan explicades al bloc de sota?</w:t>
-      </w:r>
-    </w:p>
-  </w:comment>
-  <w:comment w:id="4" w:author="Autor desconocido" w:date="2026-06-23T02:52:16Z" w:initials="">
-    <w:p>
-      <w:r>
-        <w:rPr>
-          <w:rFonts w:ascii="Times New Roman" w:hAnsi="Times New Roman" w:eastAsia="Times New Roman" w:cs="Times New Roman"/>
-          <w:b w:val="false"/>
-          <w:bCs w:val="false"/>
-          <w:i w:val="false"/>
-          <w:iCs w:val="false"/>
-          <w:caps w:val="false"/>
-          <w:smallCaps w:val="false"/>
-          <w:strike w:val="false"/>
-          <w:dstrike w:val="false"/>
-          <w:outline w:val="false"/>
-          <w:shadow w:val="false"/>
-          <w:emboss w:val="false"/>
-          <w:imprint w:val="false"/>
-          <w:color w:val="auto"/>
-          <w:spacing w:val="0"/>
-          <w:w w:val="100"/>
-          <w:kern w:val="0"/>
-          <w:position w:val="0"/>
-          <w:sz w:val="20"/>
-          <w:sz w:val="20"/>
-          <w:szCs w:val="20"/>
-          <w:u w:val="none"/>
-          <w:vertAlign w:val="baseline"/>
-          <w:em w:val="none"/>
-          <w:lang w:val="en-US" w:eastAsia="en-US" w:bidi="ar-SA"/>
-        </w:rPr>
-        <w:t>He posat una especie de conclusió/resum, Esta be?</w:t>
-      </w:r>
-    </w:p>
-    <w:p>
-      <w:r>
-        <w:rPr>
-          <w:rFonts w:ascii="Liberation Serif" w:hAnsi="Liberation Serif" w:eastAsia="Segoe UI" w:cs="Tahoma"/>
-          <w:color w:val="auto"/>
-          <w:kern w:val="0"/>
-          <w:sz w:val="24"/>
-          <w:szCs w:val="24"/>
-          <w:lang w:val="en-US" w:eastAsia="en-US" w:bidi="en-US"/>
-        </w:rPr>
-      </w:r>
-    </w:p>
-  </w:comment>
-  <w:comment w:id="5" w:author="Autor desconocido" w:date="2026-05-24T01:42:42Z" w:initials="">
-    <w:p>
-      <w:r>
-        <w:rPr>
-          <w:rFonts w:ascii="Times New Roman" w:hAnsi="Times New Roman" w:eastAsia="Times New Roman" w:cs="Times New Roman"/>
-          <w:b w:val="false"/>
-          <w:bCs w:val="false"/>
-          <w:i w:val="false"/>
-          <w:iCs w:val="false"/>
-          <w:caps w:val="false"/>
-          <w:smallCaps w:val="false"/>
-          <w:strike w:val="false"/>
-          <w:dstrike w:val="false"/>
-          <w:outline w:val="false"/>
-          <w:shadow w:val="false"/>
-          <w:emboss w:val="false"/>
-          <w:imprint w:val="false"/>
-          <w:color w:val="auto"/>
-          <w:spacing w:val="0"/>
-          <w:w w:val="100"/>
-          <w:kern w:val="0"/>
-          <w:position w:val="0"/>
-          <w:sz w:val="20"/>
-          <w:sz w:val="20"/>
-          <w:szCs w:val="20"/>
-          <w:u w:val="none"/>
-          <w:vertAlign w:val="baseline"/>
-          <w:em w:val="none"/>
-          <w:lang w:val="ca-ES" w:eastAsia="en-US" w:bidi="ar-SA"/>
-        </w:rPr>
-        <w:t>enseñar KPIs si podemos de objetivos cumplidos externos (cuanto % de clientes mas conseguimos obtener) podemos hacer referencia de los clientes que se pierden en empresas grandes. las identificacion de clientes potenciales en las empresas con metodos rudimentarios es tal. con nuestra etl esto mejora tanto %</w:t>
-      </w:r>
-    </w:p>
-  </w:comment>
-  <w:comment w:id="6" w:author="Autor desconocido" w:date="2026-06-23T02:58:52Z" w:initials="">
-    <w:p>
-      <w:r>
-        <w:rPr>
-          <w:rFonts w:ascii="Times New Roman" w:hAnsi="Times New Roman" w:eastAsia="Times New Roman" w:cs="Times New Roman"/>
-          <w:b w:val="false"/>
-          <w:bCs w:val="false"/>
-          <w:i w:val="false"/>
-          <w:iCs w:val="false"/>
-          <w:caps w:val="false"/>
-          <w:smallCaps w:val="false"/>
-          <w:strike w:val="false"/>
-          <w:dstrike w:val="false"/>
-          <w:outline w:val="false"/>
-          <w:shadow w:val="false"/>
-          <w:emboss w:val="false"/>
-          <w:imprint w:val="false"/>
-          <w:color w:val="auto"/>
-          <w:spacing w:val="0"/>
-          <w:w w:val="100"/>
-          <w:kern w:val="0"/>
-          <w:position w:val="0"/>
-          <w:sz w:val="20"/>
-          <w:sz w:val="20"/>
-          <w:szCs w:val="20"/>
-          <w:u w:val="none"/>
-          <w:vertAlign w:val="baseline"/>
-          <w:em w:val="none"/>
-          <w:lang w:val="ca-ES" w:eastAsia="en-US" w:bidi="ar-SA"/>
-        </w:rPr>
-        <w:t>No se si es la millor maner a d’introduir la secció 8, sento que  es repeteix el que es diu.</w:t>
+        <w:t>Les limitacions i glossaris estan després de la conclusió. Hauria de moure’ls de lloc? O posarlos al apendix?</w:t>
       </w:r>
     </w:p>
   </w:comment>
@@ -10678,6 +10211,42 @@
 </file>
 
 <file path=word/footer5.xml><?xml version="1.0" encoding="utf-8"?>
+<w:ftr xmlns:o="urn:schemas-microsoft-com:office:office" xmlns:r="http://schemas.openxmlformats.org/officeDocument/2006/relationships" xmlns:v="urn:schemas-microsoft-com:vml" xmlns:w="http://schemas.openxmlformats.org/wordprocessingml/2006/main" xmlns:w10="urn:schemas-microsoft-com:office:word" xmlns:wp="http://schemas.openxmlformats.org/drawingml/2006/wordprocessingDrawing" xmlns:wps="http://schemas.microsoft.com/office/word/2010/wordprocessingShape" xmlns:wpg="http://schemas.microsoft.com/office/word/2010/wordprocessingGroup" xmlns:mc="http://schemas.openxmlformats.org/markup-compatibility/2006" xmlns:wp14="http://schemas.microsoft.com/office/word/2010/wordprocessingDrawing" xmlns:w14="http://schemas.microsoft.com/office/word/2010/wordml" mc:Ignorable="w14 wp14">
+  <w:p>
+    <w:pPr>
+      <w:pStyle w:val="Normal"/>
+      <w:spacing w:lineRule="exact" w:line="20" w:before="0" w:after="200"/>
+      <w:jc w:val="center"/>
+      <w:rPr>
+        <w:rFonts w:ascii="Arial" w:hAnsi="Arial"/>
+      </w:rPr>
+    </w:pPr>
+    <w:r>
+      <w:rPr>
+        <w:rFonts w:ascii="Arial" w:hAnsi="Arial"/>
+      </w:rPr>
+    </w:r>
+  </w:p>
+</w:ftr>
+</file>
+
+<file path=word/footer6.xml><?xml version="1.0" encoding="utf-8"?>
+<w:ftr xmlns:o="urn:schemas-microsoft-com:office:office" xmlns:r="http://schemas.openxmlformats.org/officeDocument/2006/relationships" xmlns:v="urn:schemas-microsoft-com:vml" xmlns:w="http://schemas.openxmlformats.org/wordprocessingml/2006/main" xmlns:w10="urn:schemas-microsoft-com:office:word" xmlns:wp="http://schemas.openxmlformats.org/drawingml/2006/wordprocessingDrawing" xmlns:wps="http://schemas.microsoft.com/office/word/2010/wordprocessingShape" xmlns:wpg="http://schemas.microsoft.com/office/word/2010/wordprocessingGroup" xmlns:mc="http://schemas.openxmlformats.org/markup-compatibility/2006" xmlns:wp14="http://schemas.microsoft.com/office/word/2010/wordprocessingDrawing" xmlns:w14="http://schemas.microsoft.com/office/word/2010/wordml" mc:Ignorable="w14 wp14">
+  <w:p>
+    <w:pPr>
+      <w:pStyle w:val="Normal"/>
+      <w:spacing w:lineRule="exact" w:line="20" w:before="0" w:after="200"/>
+      <w:jc w:val="center"/>
+      <w:rPr/>
+    </w:pPr>
+    <w:r>
+      <w:rPr/>
+    </w:r>
+  </w:p>
+</w:ftr>
+</file>
+
+<file path=word/footer7.xml><?xml version="1.0" encoding="utf-8"?>
 <w:ftr xmlns:o="urn:schemas-microsoft-com:office:office" xmlns:r="http://schemas.openxmlformats.org/officeDocument/2006/relationships" xmlns:v="urn:schemas-microsoft-com:vml" xmlns:w="http://schemas.openxmlformats.org/wordprocessingml/2006/main" xmlns:w10="urn:schemas-microsoft-com:office:word" xmlns:wp="http://schemas.openxmlformats.org/drawingml/2006/wordprocessingDrawing" xmlns:wps="http://schemas.microsoft.com/office/word/2010/wordprocessingShape" xmlns:wpg="http://schemas.microsoft.com/office/word/2010/wordprocessingGroup" xmlns:mc="http://schemas.openxmlformats.org/markup-compatibility/2006" xmlns:wp14="http://schemas.microsoft.com/office/word/2010/wordprocessingDrawing" xmlns:w14="http://schemas.microsoft.com/office/word/2010/wordml" mc:Ignorable="w14 wp14">
   <w:p>
     <w:pPr>
@@ -11065,7 +10634,169 @@
     </w:r>
     <w:r>
       <w:rPr/>
-      <w:t>11</w:t>
+      <w:t>13</w:t>
+    </w:r>
+    <w:r>
+      <w:rPr/>
+      <w:fldChar w:fldCharType="end"/>
+    </w:r>
+  </w:p>
+</w:hdr>
+</file>
+
+<file path=word/header6.xml><?xml version="1.0" encoding="utf-8"?>
+<w:hdr xmlns:o="urn:schemas-microsoft-com:office:office" xmlns:r="http://schemas.openxmlformats.org/officeDocument/2006/relationships" xmlns:v="urn:schemas-microsoft-com:vml" xmlns:w="http://schemas.openxmlformats.org/wordprocessingml/2006/main" xmlns:w10="urn:schemas-microsoft-com:office:word" xmlns:wp="http://schemas.openxmlformats.org/drawingml/2006/wordprocessingDrawing" xmlns:wps="http://schemas.microsoft.com/office/word/2010/wordprocessingShape" xmlns:wpg="http://schemas.microsoft.com/office/word/2010/wordprocessingGroup" xmlns:mc="http://schemas.openxmlformats.org/markup-compatibility/2006" xmlns:wp14="http://schemas.microsoft.com/office/word/2010/wordprocessingDrawing" xmlns:w14="http://schemas.microsoft.com/office/word/2010/wordml" mc:Ignorable="w14 wp14">
+  <w:p>
+    <w:pPr>
+      <w:pStyle w:val="Cabecera"/>
+      <w:tabs>
+        <w:tab w:val="clear" w:pos="10200"/>
+        <w:tab w:val="right" w:pos="10320" w:leader="none"/>
+      </w:tabs>
+      <w:spacing w:lineRule="exact" w:line="180" w:before="0" w:after="200"/>
+      <w:rPr/>
+    </w:pPr>
+    <w:r>
+      <w:rPr>
+        <w:shd w:fill="auto" w:val="clear"/>
+      </w:rPr>
+      <w:fldChar w:fldCharType="begin"/>
+    </w:r>
+    <w:r>
+      <w:rPr>
+        <w:shd w:fill="auto" w:val="clear"/>
+      </w:rPr>
+      <w:instrText> PAGE </w:instrText>
+    </w:r>
+    <w:r>
+      <w:rPr>
+        <w:shd w:fill="auto" w:val="clear"/>
+      </w:rPr>
+      <w:fldChar w:fldCharType="separate"/>
+    </w:r>
+    <w:r>
+      <w:rPr>
+        <w:shd w:fill="auto" w:val="clear"/>
+      </w:rPr>
+      <w:t>12</w:t>
+    </w:r>
+    <w:r>
+      <w:rPr>
+        <w:shd w:fill="auto" w:val="clear"/>
+      </w:rPr>
+      <w:fldChar w:fldCharType="end"/>
+    </w:r>
+    <w:r>
+      <w:rPr>
+        <w:rStyle w:val="DefaultParagraphFont"/>
+        <w:b/>
+        <w:i/>
+        <w:vanish/>
+        <w:shd w:fill="auto" w:val="clear"/>
+        <w:lang w:val="es-ES"/>
+      </w:rPr>
+      <w:t xml:space="preserve">   </w:t>
+    </w:r>
+    <w:r>
+      <w:rPr>
+        <w:rStyle w:val="DefaultParagraphFont"/>
+        <w:i/>
+        <w:caps w:val="false"/>
+        <w:smallCaps w:val="false"/>
+        <w:vanish/>
+        <w:shd w:fill="auto" w:val="clear"/>
+        <w:lang w:val="es-ES"/>
+      </w:rPr>
+      <w:t>even page</w:t>
+    </w:r>
+    <w:r>
+      <w:rPr>
+        <w:rStyle w:val="DefaultParagraphFont"/>
+        <w:lang w:val="es-ES"/>
+      </w:rPr>
+      <w:tab/>
+    </w:r>
+    <w:r>
+      <w:rPr>
+        <w:rStyle w:val="DefaultParagraphFont"/>
+        <w:lang w:val="ca-ES"/>
+      </w:rPr>
+      <w:t xml:space="preserve">EE/UAB TFG DADES: </w:t>
+    </w:r>
+    <w:r>
+      <w:rPr>
+        <w:rStyle w:val="DefaultParagraphFont"/>
+        <w:color w:val="000000"/>
+        <w:lang w:val="ca-ES"/>
+      </w:rPr>
+      <w:t>Construcció d’una ETL per a la consolidació de prospecció comerCIAL</w:t>
+    </w:r>
+  </w:p>
+</w:hdr>
+</file>
+
+<file path=word/header7.xml><?xml version="1.0" encoding="utf-8"?>
+<w:hdr xmlns:o="urn:schemas-microsoft-com:office:office" xmlns:r="http://schemas.openxmlformats.org/officeDocument/2006/relationships" xmlns:v="urn:schemas-microsoft-com:vml" xmlns:w="http://schemas.openxmlformats.org/wordprocessingml/2006/main" xmlns:w10="urn:schemas-microsoft-com:office:word" xmlns:wp="http://schemas.openxmlformats.org/drawingml/2006/wordprocessingDrawing" xmlns:wps="http://schemas.microsoft.com/office/word/2010/wordprocessingShape" xmlns:wpg="http://schemas.microsoft.com/office/word/2010/wordprocessingGroup" xmlns:mc="http://schemas.openxmlformats.org/markup-compatibility/2006" xmlns:wp14="http://schemas.microsoft.com/office/word/2010/wordprocessingDrawing" xmlns:w14="http://schemas.microsoft.com/office/word/2010/wordml" mc:Ignorable="w14 wp14">
+  <w:p>
+    <w:pPr>
+      <w:pStyle w:val="Cabecera"/>
+      <w:tabs>
+        <w:tab w:val="clear" w:pos="10200"/>
+        <w:tab w:val="right" w:pos="10320" w:leader="none"/>
+      </w:tabs>
+      <w:spacing w:lineRule="exact" w:line="180" w:before="0" w:after="200"/>
+      <w:rPr/>
+    </w:pPr>
+    <w:r>
+      <w:rPr/>
+      <w:t xml:space="preserve">Dante rodríguez Milán: </w:t>
+    </w:r>
+    <w:r>
+      <w:rPr>
+        <w:rStyle w:val="DefaultParagraphFont"/>
+        <w:color w:val="000000"/>
+        <w:lang w:val="ca-ES"/>
+      </w:rPr>
+      <w:t>Construcció d’una ETL per a la consolidació de prospecció comercial</w:t>
+    </w:r>
+    <w:r>
+      <w:rPr/>
+      <w:tab/>
+    </w:r>
+    <w:r>
+      <w:rPr>
+        <w:rStyle w:val="DefaultParagraphFont"/>
+        <w:i/>
+        <w:caps w:val="false"/>
+        <w:smallCaps w:val="false"/>
+        <w:vanish/>
+      </w:rPr>
+      <w:t>odd page</w:t>
+    </w:r>
+    <w:r>
+      <w:rPr>
+        <w:rStyle w:val="DefaultParagraphFont"/>
+        <w:caps w:val="false"/>
+        <w:smallCaps w:val="false"/>
+        <w:vanish/>
+      </w:rPr>
+      <w:t xml:space="preserve">    </w:t>
+    </w:r>
+    <w:r>
+      <w:rPr/>
+      <w:fldChar w:fldCharType="begin"/>
+    </w:r>
+    <w:r>
+      <w:rPr/>
+      <w:instrText> PAGE </w:instrText>
+    </w:r>
+    <w:r>
+      <w:rPr/>
+      <w:fldChar w:fldCharType="separate"/>
+    </w:r>
+    <w:r>
+      <w:rPr/>
+      <w:t>13</w:t>
     </w:r>
     <w:r>
       <w:rPr/>
@@ -12240,7 +11971,7 @@
       <w:widowControl w:val="false"/>
       <w:shd w:val="clear" w:fill="auto"/>
       <w:suppressAutoHyphens w:val="false"/>
-      <w:overflowPunct w:val="true"/>
+      <w:overflowPunct w:val="false"/>
       <w:bidi w:val="0"/>
       <w:snapToGrid w:val="true"/>
       <w:spacing w:lineRule="exact" w:line="230" w:before="0" w:after="200"/>
@@ -12688,7 +12419,7 @@
       <w:widowControl w:val="false"/>
       <w:shd w:val="clear" w:fill="auto"/>
       <w:suppressAutoHyphens w:val="true"/>
-      <w:overflowPunct w:val="true"/>
+      <w:overflowPunct w:val="false"/>
       <w:bidi w:val="0"/>
       <w:snapToGrid w:val="true"/>
       <w:spacing w:lineRule="auto" w:line="240" w:before="0" w:after="0"/>
@@ -13394,7 +13125,7 @@
       <w:widowControl/>
       <w:shd w:val="clear" w:fill="auto"/>
       <w:suppressAutoHyphens w:val="true"/>
-      <w:overflowPunct w:val="true"/>
+      <w:overflowPunct w:val="false"/>
       <w:bidi w:val="0"/>
       <w:snapToGrid w:val="true"/>
       <w:spacing w:lineRule="auto" w:line="276" w:before="0" w:after="200"/>

</xml_diff>